<commit_message>
Successfully completed all test cases and verified the requirements are complete
</commit_message>
<xml_diff>
--- a/Insomniac_Test_Plan_and_Traceability_Matrix.docx
+++ b/Insomniac_Test_Plan_and_Traceability_Matrix.docx
@@ -174,7 +174,7 @@
         <w:rPr>
           <w:rFonts w:ascii="Times New Roman" w:hAnsi="Times New Roman" w:cs="Times New Roman"/>
         </w:rPr>
-        <w:t>0</w:t>
+        <w:t>1</w:t>
       </w:r>
     </w:p>
     <w:p>
@@ -207,13 +207,31 @@
         <w:rPr>
           <w:rFonts w:ascii="Times New Roman" w:hAnsi="Times New Roman" w:cs="Times New Roman"/>
         </w:rPr>
-        <w:t>13</w:t>
+        <w:t>1</w:t>
       </w:r>
       <w:r>
         <w:rPr>
           <w:rFonts w:ascii="Times New Roman" w:hAnsi="Times New Roman" w:cs="Times New Roman"/>
         </w:rPr>
-        <w:t>/26</w:t>
+        <w:t>5</w:t>
+      </w:r>
+      <w:r>
+        <w:rPr>
+          <w:rFonts w:ascii="Times New Roman" w:hAnsi="Times New Roman" w:cs="Times New Roman"/>
+        </w:rPr>
+        <w:t>/</w:t>
+      </w:r>
+      <w:r>
+        <w:rPr>
+          <w:rFonts w:ascii="Times New Roman" w:hAnsi="Times New Roman" w:cs="Times New Roman"/>
+        </w:rPr>
+        <w:t>20</w:t>
+      </w:r>
+      <w:r>
+        <w:rPr>
+          <w:rFonts w:ascii="Times New Roman" w:hAnsi="Times New Roman" w:cs="Times New Roman"/>
+        </w:rPr>
+        <w:t>26</w:t>
       </w:r>
     </w:p>
     <w:p>
@@ -272,7 +290,7 @@
         </w:rPr>
         <w:fldChar w:fldCharType="separate"/>
       </w:r>
-      <w:hyperlink w:anchor="_Toc229583513" w:history="1">
+      <w:hyperlink w:anchor="_Toc229730988" w:history="1">
         <w:r>
           <w:rPr>
             <w:rStyle w:val="Hyperlink"/>
@@ -320,7 +338,7 @@
             <w:noProof/>
             <w:webHidden/>
           </w:rPr>
-          <w:instrText xml:space="preserve"> PAGEREF _Toc229583513 \h </w:instrText>
+          <w:instrText xml:space="preserve"> PAGEREF _Toc229730988 \h </w:instrText>
         </w:r>
         <w:r>
           <w:rPr>
@@ -366,7 +384,7 @@
           <w14:ligatures w14:val="standardContextual"/>
         </w:rPr>
       </w:pPr>
-      <w:hyperlink w:anchor="_Toc229583514" w:history="1">
+      <w:hyperlink w:anchor="_Toc229730989" w:history="1">
         <w:r>
           <w:rPr>
             <w:rStyle w:val="Hyperlink"/>
@@ -414,7 +432,7 @@
             <w:noProof/>
             <w:webHidden/>
           </w:rPr>
-          <w:instrText xml:space="preserve"> PAGEREF _Toc229583514 \h </w:instrText>
+          <w:instrText xml:space="preserve"> PAGEREF _Toc229730989 \h </w:instrText>
         </w:r>
         <w:r>
           <w:rPr>
@@ -460,7 +478,7 @@
           <w14:ligatures w14:val="standardContextual"/>
         </w:rPr>
       </w:pPr>
-      <w:hyperlink w:anchor="_Toc229583515" w:history="1">
+      <w:hyperlink w:anchor="_Toc229730990" w:history="1">
         <w:r>
           <w:rPr>
             <w:rStyle w:val="Hyperlink"/>
@@ -508,7 +526,7 @@
             <w:noProof/>
             <w:webHidden/>
           </w:rPr>
-          <w:instrText xml:space="preserve"> PAGEREF _Toc229583515 \h </w:instrText>
+          <w:instrText xml:space="preserve"> PAGEREF _Toc229730990 \h </w:instrText>
         </w:r>
         <w:r>
           <w:rPr>
@@ -551,7 +569,7 @@
           <w14:ligatures w14:val="standardContextual"/>
         </w:rPr>
       </w:pPr>
-      <w:hyperlink w:anchor="_Toc229583516" w:history="1">
+      <w:hyperlink w:anchor="_Toc229730991" w:history="1">
         <w:r>
           <w:rPr>
             <w:rStyle w:val="Hyperlink"/>
@@ -591,7 +609,7 @@
           <w:rPr>
             <w:webHidden/>
           </w:rPr>
-          <w:instrText xml:space="preserve"> PAGEREF _Toc229583516 \h </w:instrText>
+          <w:instrText xml:space="preserve"> PAGEREF _Toc229730991 \h </w:instrText>
         </w:r>
         <w:r>
           <w:rPr>
@@ -630,7 +648,7 @@
           <w14:ligatures w14:val="standardContextual"/>
         </w:rPr>
       </w:pPr>
-      <w:hyperlink w:anchor="_Toc229583517" w:history="1">
+      <w:hyperlink w:anchor="_Toc229730992" w:history="1">
         <w:r>
           <w:rPr>
             <w:rStyle w:val="Hyperlink"/>
@@ -670,7 +688,7 @@
           <w:rPr>
             <w:webHidden/>
           </w:rPr>
-          <w:instrText xml:space="preserve"> PAGEREF _Toc229583517 \h </w:instrText>
+          <w:instrText xml:space="preserve"> PAGEREF _Toc229730992 \h </w:instrText>
         </w:r>
         <w:r>
           <w:rPr>
@@ -712,7 +730,7 @@
           <w14:ligatures w14:val="standardContextual"/>
         </w:rPr>
       </w:pPr>
-      <w:hyperlink w:anchor="_Toc229583518" w:history="1">
+      <w:hyperlink w:anchor="_Toc229730993" w:history="1">
         <w:r>
           <w:rPr>
             <w:rStyle w:val="Hyperlink"/>
@@ -760,7 +778,7 @@
             <w:noProof/>
             <w:webHidden/>
           </w:rPr>
-          <w:instrText xml:space="preserve"> PAGEREF _Toc229583518 \h </w:instrText>
+          <w:instrText xml:space="preserve"> PAGEREF _Toc229730993 \h </w:instrText>
         </w:r>
         <w:r>
           <w:rPr>
@@ -806,7 +824,7 @@
           <w14:ligatures w14:val="standardContextual"/>
         </w:rPr>
       </w:pPr>
-      <w:hyperlink w:anchor="_Toc229583519" w:history="1">
+      <w:hyperlink w:anchor="_Toc229730994" w:history="1">
         <w:r>
           <w:rPr>
             <w:rStyle w:val="Hyperlink"/>
@@ -854,7 +872,7 @@
             <w:noProof/>
             <w:webHidden/>
           </w:rPr>
-          <w:instrText xml:space="preserve"> PAGEREF _Toc229583519 \h </w:instrText>
+          <w:instrText xml:space="preserve"> PAGEREF _Toc229730994 \h </w:instrText>
         </w:r>
         <w:r>
           <w:rPr>
@@ -900,7 +918,7 @@
           <w14:ligatures w14:val="standardContextual"/>
         </w:rPr>
       </w:pPr>
-      <w:hyperlink w:anchor="_Toc229583520" w:history="1">
+      <w:hyperlink w:anchor="_Toc229730995" w:history="1">
         <w:r>
           <w:rPr>
             <w:rStyle w:val="Hyperlink"/>
@@ -948,7 +966,7 @@
             <w:noProof/>
             <w:webHidden/>
           </w:rPr>
-          <w:instrText xml:space="preserve"> PAGEREF _Toc229583520 \h </w:instrText>
+          <w:instrText xml:space="preserve"> PAGEREF _Toc229730995 \h </w:instrText>
         </w:r>
         <w:r>
           <w:rPr>
@@ -991,7 +1009,7 @@
           <w14:ligatures w14:val="standardContextual"/>
         </w:rPr>
       </w:pPr>
-      <w:hyperlink w:anchor="_Toc229583521" w:history="1">
+      <w:hyperlink w:anchor="_Toc229730996" w:history="1">
         <w:r>
           <w:rPr>
             <w:rStyle w:val="Hyperlink"/>
@@ -1031,7 +1049,7 @@
           <w:rPr>
             <w:webHidden/>
           </w:rPr>
-          <w:instrText xml:space="preserve"> PAGEREF _Toc229583521 \h </w:instrText>
+          <w:instrText xml:space="preserve"> PAGEREF _Toc229730996 \h </w:instrText>
         </w:r>
         <w:r>
           <w:rPr>
@@ -1070,7 +1088,7 @@
           <w14:ligatures w14:val="standardContextual"/>
         </w:rPr>
       </w:pPr>
-      <w:hyperlink w:anchor="_Toc229583522" w:history="1">
+      <w:hyperlink w:anchor="_Toc229730997" w:history="1">
         <w:r>
           <w:rPr>
             <w:rStyle w:val="Hyperlink"/>
@@ -1110,7 +1128,7 @@
           <w:rPr>
             <w:webHidden/>
           </w:rPr>
-          <w:instrText xml:space="preserve"> PAGEREF _Toc229583522 \h </w:instrText>
+          <w:instrText xml:space="preserve"> PAGEREF _Toc229730997 \h </w:instrText>
         </w:r>
         <w:r>
           <w:rPr>
@@ -1149,7 +1167,7 @@
           <w14:ligatures w14:val="standardContextual"/>
         </w:rPr>
       </w:pPr>
-      <w:hyperlink w:anchor="_Toc229583523" w:history="1">
+      <w:hyperlink w:anchor="_Toc229730998" w:history="1">
         <w:r>
           <w:rPr>
             <w:rStyle w:val="Hyperlink"/>
@@ -1189,7 +1207,7 @@
           <w:rPr>
             <w:webHidden/>
           </w:rPr>
-          <w:instrText xml:space="preserve"> PAGEREF _Toc229583523 \h </w:instrText>
+          <w:instrText xml:space="preserve"> PAGEREF _Toc229730998 \h </w:instrText>
         </w:r>
         <w:r>
           <w:rPr>
@@ -1231,7 +1249,7 @@
           <w14:ligatures w14:val="standardContextual"/>
         </w:rPr>
       </w:pPr>
-      <w:hyperlink w:anchor="_Toc229583524" w:history="1">
+      <w:hyperlink w:anchor="_Toc229730999" w:history="1">
         <w:r>
           <w:rPr>
             <w:rStyle w:val="Hyperlink"/>
@@ -1279,7 +1297,7 @@
             <w:noProof/>
             <w:webHidden/>
           </w:rPr>
-          <w:instrText xml:space="preserve"> PAGEREF _Toc229583524 \h </w:instrText>
+          <w:instrText xml:space="preserve"> PAGEREF _Toc229730999 \h </w:instrText>
         </w:r>
         <w:r>
           <w:rPr>
@@ -1322,7 +1340,7 @@
           <w14:ligatures w14:val="standardContextual"/>
         </w:rPr>
       </w:pPr>
-      <w:hyperlink w:anchor="_Toc229583525" w:history="1">
+      <w:hyperlink w:anchor="_Toc229731000" w:history="1">
         <w:r>
           <w:rPr>
             <w:rStyle w:val="Hyperlink"/>
@@ -1362,7 +1380,7 @@
           <w:rPr>
             <w:webHidden/>
           </w:rPr>
-          <w:instrText xml:space="preserve"> PAGEREF _Toc229583525 \h </w:instrText>
+          <w:instrText xml:space="preserve"> PAGEREF _Toc229731000 \h </w:instrText>
         </w:r>
         <w:r>
           <w:rPr>
@@ -1401,7 +1419,7 @@
           <w14:ligatures w14:val="standardContextual"/>
         </w:rPr>
       </w:pPr>
-      <w:hyperlink w:anchor="_Toc229583526" w:history="1">
+      <w:hyperlink w:anchor="_Toc229731001" w:history="1">
         <w:r>
           <w:rPr>
             <w:rStyle w:val="Hyperlink"/>
@@ -1441,7 +1459,7 @@
           <w:rPr>
             <w:webHidden/>
           </w:rPr>
-          <w:instrText xml:space="preserve"> PAGEREF _Toc229583526 \h </w:instrText>
+          <w:instrText xml:space="preserve"> PAGEREF _Toc229731001 \h </w:instrText>
         </w:r>
         <w:r>
           <w:rPr>
@@ -1480,7 +1498,7 @@
           <w14:ligatures w14:val="standardContextual"/>
         </w:rPr>
       </w:pPr>
-      <w:hyperlink w:anchor="_Toc229583527" w:history="1">
+      <w:hyperlink w:anchor="_Toc229731002" w:history="1">
         <w:r>
           <w:rPr>
             <w:rStyle w:val="Hyperlink"/>
@@ -1520,7 +1538,7 @@
           <w:rPr>
             <w:webHidden/>
           </w:rPr>
-          <w:instrText xml:space="preserve"> PAGEREF _Toc229583527 \h </w:instrText>
+          <w:instrText xml:space="preserve"> PAGEREF _Toc229731002 \h </w:instrText>
         </w:r>
         <w:r>
           <w:rPr>
@@ -1559,7 +1577,7 @@
           <w14:ligatures w14:val="standardContextual"/>
         </w:rPr>
       </w:pPr>
-      <w:hyperlink w:anchor="_Toc229583528" w:history="1">
+      <w:hyperlink w:anchor="_Toc229731003" w:history="1">
         <w:r>
           <w:rPr>
             <w:rStyle w:val="Hyperlink"/>
@@ -1599,7 +1617,7 @@
           <w:rPr>
             <w:webHidden/>
           </w:rPr>
-          <w:instrText xml:space="preserve"> PAGEREF _Toc229583528 \h </w:instrText>
+          <w:instrText xml:space="preserve"> PAGEREF _Toc229731003 \h </w:instrText>
         </w:r>
         <w:r>
           <w:rPr>
@@ -1638,7 +1656,7 @@
           <w14:ligatures w14:val="standardContextual"/>
         </w:rPr>
       </w:pPr>
-      <w:hyperlink w:anchor="_Toc229583529" w:history="1">
+      <w:hyperlink w:anchor="_Toc229731004" w:history="1">
         <w:r>
           <w:rPr>
             <w:rStyle w:val="Hyperlink"/>
@@ -1678,7 +1696,7 @@
           <w:rPr>
             <w:webHidden/>
           </w:rPr>
-          <w:instrText xml:space="preserve"> PAGEREF _Toc229583529 \h </w:instrText>
+          <w:instrText xml:space="preserve"> PAGEREF _Toc229731004 \h </w:instrText>
         </w:r>
         <w:r>
           <w:rPr>
@@ -1717,7 +1735,7 @@
           <w14:ligatures w14:val="standardContextual"/>
         </w:rPr>
       </w:pPr>
-      <w:hyperlink w:anchor="_Toc229583530" w:history="1">
+      <w:hyperlink w:anchor="_Toc229731005" w:history="1">
         <w:r>
           <w:rPr>
             <w:rStyle w:val="Hyperlink"/>
@@ -1757,7 +1775,7 @@
           <w:rPr>
             <w:webHidden/>
           </w:rPr>
-          <w:instrText xml:space="preserve"> PAGEREF _Toc229583530 \h </w:instrText>
+          <w:instrText xml:space="preserve"> PAGEREF _Toc229731005 \h </w:instrText>
         </w:r>
         <w:r>
           <w:rPr>
@@ -1796,7 +1814,7 @@
           <w14:ligatures w14:val="standardContextual"/>
         </w:rPr>
       </w:pPr>
-      <w:hyperlink w:anchor="_Toc229583531" w:history="1">
+      <w:hyperlink w:anchor="_Toc229731006" w:history="1">
         <w:r>
           <w:rPr>
             <w:rStyle w:val="Hyperlink"/>
@@ -1836,7 +1854,7 @@
           <w:rPr>
             <w:webHidden/>
           </w:rPr>
-          <w:instrText xml:space="preserve"> PAGEREF _Toc229583531 \h </w:instrText>
+          <w:instrText xml:space="preserve"> PAGEREF _Toc229731006 \h </w:instrText>
         </w:r>
         <w:r>
           <w:rPr>
@@ -1878,7 +1896,7 @@
           <w14:ligatures w14:val="standardContextual"/>
         </w:rPr>
       </w:pPr>
-      <w:hyperlink w:anchor="_Toc229583532" w:history="1">
+      <w:hyperlink w:anchor="_Toc229731007" w:history="1">
         <w:r>
           <w:rPr>
             <w:rStyle w:val="Hyperlink"/>
@@ -1926,7 +1944,7 @@
             <w:noProof/>
             <w:webHidden/>
           </w:rPr>
-          <w:instrText xml:space="preserve"> PAGEREF _Toc229583532 \h </w:instrText>
+          <w:instrText xml:space="preserve"> PAGEREF _Toc229731007 \h </w:instrText>
         </w:r>
         <w:r>
           <w:rPr>
@@ -1972,7 +1990,7 @@
           <w14:ligatures w14:val="standardContextual"/>
         </w:rPr>
       </w:pPr>
-      <w:hyperlink w:anchor="_Toc229583533" w:history="1">
+      <w:hyperlink w:anchor="_Toc229731008" w:history="1">
         <w:r>
           <w:rPr>
             <w:rStyle w:val="Hyperlink"/>
@@ -2020,7 +2038,7 @@
             <w:noProof/>
             <w:webHidden/>
           </w:rPr>
-          <w:instrText xml:space="preserve"> PAGEREF _Toc229583533 \h </w:instrText>
+          <w:instrText xml:space="preserve"> PAGEREF _Toc229731008 \h </w:instrText>
         </w:r>
         <w:r>
           <w:rPr>
@@ -2066,7 +2084,7 @@
           <w14:ligatures w14:val="standardContextual"/>
         </w:rPr>
       </w:pPr>
-      <w:hyperlink w:anchor="_Toc229583534" w:history="1">
+      <w:hyperlink w:anchor="_Toc229731009" w:history="1">
         <w:r>
           <w:rPr>
             <w:rStyle w:val="Hyperlink"/>
@@ -2114,7 +2132,7 @@
             <w:noProof/>
             <w:webHidden/>
           </w:rPr>
-          <w:instrText xml:space="preserve"> PAGEREF _Toc229583534 \h </w:instrText>
+          <w:instrText xml:space="preserve"> PAGEREF _Toc229731009 \h </w:instrText>
         </w:r>
         <w:r>
           <w:rPr>
@@ -2157,7 +2175,7 @@
           <w14:ligatures w14:val="standardContextual"/>
         </w:rPr>
       </w:pPr>
-      <w:hyperlink w:anchor="_Toc229583535" w:history="1">
+      <w:hyperlink w:anchor="_Toc229731010" w:history="1">
         <w:r>
           <w:rPr>
             <w:rStyle w:val="Hyperlink"/>
@@ -2197,7 +2215,7 @@
           <w:rPr>
             <w:webHidden/>
           </w:rPr>
-          <w:instrText xml:space="preserve"> PAGEREF _Toc229583535 \h </w:instrText>
+          <w:instrText xml:space="preserve"> PAGEREF _Toc229731010 \h </w:instrText>
         </w:r>
         <w:r>
           <w:rPr>
@@ -2236,7 +2254,7 @@
           <w14:ligatures w14:val="standardContextual"/>
         </w:rPr>
       </w:pPr>
-      <w:hyperlink w:anchor="_Toc229583536" w:history="1">
+      <w:hyperlink w:anchor="_Toc229731011" w:history="1">
         <w:r>
           <w:rPr>
             <w:rStyle w:val="Hyperlink"/>
@@ -2276,7 +2294,7 @@
           <w:rPr>
             <w:webHidden/>
           </w:rPr>
-          <w:instrText xml:space="preserve"> PAGEREF _Toc229583536 \h </w:instrText>
+          <w:instrText xml:space="preserve"> PAGEREF _Toc229731011 \h </w:instrText>
         </w:r>
         <w:r>
           <w:rPr>
@@ -2318,7 +2336,7 @@
           <w14:ligatures w14:val="standardContextual"/>
         </w:rPr>
       </w:pPr>
-      <w:hyperlink w:anchor="_Toc229583537" w:history="1">
+      <w:hyperlink w:anchor="_Toc229731012" w:history="1">
         <w:r>
           <w:rPr>
             <w:rStyle w:val="Hyperlink"/>
@@ -2366,7 +2384,7 @@
             <w:noProof/>
             <w:webHidden/>
           </w:rPr>
-          <w:instrText xml:space="preserve"> PAGEREF _Toc229583537 \h </w:instrText>
+          <w:instrText xml:space="preserve"> PAGEREF _Toc229731012 \h </w:instrText>
         </w:r>
         <w:r>
           <w:rPr>
@@ -2409,7 +2427,7 @@
           <w14:ligatures w14:val="standardContextual"/>
         </w:rPr>
       </w:pPr>
-      <w:hyperlink w:anchor="_Toc229583538" w:history="1">
+      <w:hyperlink w:anchor="_Toc229731013" w:history="1">
         <w:r>
           <w:rPr>
             <w:rStyle w:val="Hyperlink"/>
@@ -2449,7 +2467,7 @@
           <w:rPr>
             <w:webHidden/>
           </w:rPr>
-          <w:instrText xml:space="preserve"> PAGEREF _Toc229583538 \h </w:instrText>
+          <w:instrText xml:space="preserve"> PAGEREF _Toc229731013 \h </w:instrText>
         </w:r>
         <w:r>
           <w:rPr>
@@ -2488,7 +2506,7 @@
           <w14:ligatures w14:val="standardContextual"/>
         </w:rPr>
       </w:pPr>
-      <w:hyperlink w:anchor="_Toc229583539" w:history="1">
+      <w:hyperlink w:anchor="_Toc229731014" w:history="1">
         <w:r>
           <w:rPr>
             <w:rStyle w:val="Hyperlink"/>
@@ -2528,7 +2546,7 @@
           <w:rPr>
             <w:webHidden/>
           </w:rPr>
-          <w:instrText xml:space="preserve"> PAGEREF _Toc229583539 \h </w:instrText>
+          <w:instrText xml:space="preserve"> PAGEREF _Toc229731014 \h </w:instrText>
         </w:r>
         <w:r>
           <w:rPr>
@@ -2570,7 +2588,7 @@
           <w14:ligatures w14:val="standardContextual"/>
         </w:rPr>
       </w:pPr>
-      <w:hyperlink w:anchor="_Toc229583540" w:history="1">
+      <w:hyperlink w:anchor="_Toc229731015" w:history="1">
         <w:r>
           <w:rPr>
             <w:rStyle w:val="Hyperlink"/>
@@ -2618,7 +2636,7 @@
             <w:noProof/>
             <w:webHidden/>
           </w:rPr>
-          <w:instrText xml:space="preserve"> PAGEREF _Toc229583540 \h </w:instrText>
+          <w:instrText xml:space="preserve"> PAGEREF _Toc229731015 \h </w:instrText>
         </w:r>
         <w:r>
           <w:rPr>
@@ -2661,7 +2679,7 @@
           <w14:ligatures w14:val="standardContextual"/>
         </w:rPr>
       </w:pPr>
-      <w:hyperlink w:anchor="_Toc229583541" w:history="1">
+      <w:hyperlink w:anchor="_Toc229731016" w:history="1">
         <w:r>
           <w:rPr>
             <w:rStyle w:val="Hyperlink"/>
@@ -2701,7 +2719,7 @@
           <w:rPr>
             <w:webHidden/>
           </w:rPr>
-          <w:instrText xml:space="preserve"> PAGEREF _Toc229583541 \h </w:instrText>
+          <w:instrText xml:space="preserve"> PAGEREF _Toc229731016 \h </w:instrText>
         </w:r>
         <w:r>
           <w:rPr>
@@ -2740,7 +2758,7 @@
           <w14:ligatures w14:val="standardContextual"/>
         </w:rPr>
       </w:pPr>
-      <w:hyperlink w:anchor="_Toc229583542" w:history="1">
+      <w:hyperlink w:anchor="_Toc229731017" w:history="1">
         <w:r>
           <w:rPr>
             <w:rStyle w:val="Hyperlink"/>
@@ -2780,7 +2798,7 @@
           <w:rPr>
             <w:webHidden/>
           </w:rPr>
-          <w:instrText xml:space="preserve"> PAGEREF _Toc229583542 \h </w:instrText>
+          <w:instrText xml:space="preserve"> PAGEREF _Toc229731017 \h </w:instrText>
         </w:r>
         <w:r>
           <w:rPr>
@@ -2822,7 +2840,7 @@
           <w14:ligatures w14:val="standardContextual"/>
         </w:rPr>
       </w:pPr>
-      <w:hyperlink w:anchor="_Toc229583543" w:history="1">
+      <w:hyperlink w:anchor="_Toc229731018" w:history="1">
         <w:r>
           <w:rPr>
             <w:rStyle w:val="Hyperlink"/>
@@ -2870,7 +2888,7 @@
             <w:noProof/>
             <w:webHidden/>
           </w:rPr>
-          <w:instrText xml:space="preserve"> PAGEREF _Toc229583543 \h </w:instrText>
+          <w:instrText xml:space="preserve"> PAGEREF _Toc229731018 \h </w:instrText>
         </w:r>
         <w:r>
           <w:rPr>
@@ -2916,7 +2934,7 @@
           <w14:ligatures w14:val="standardContextual"/>
         </w:rPr>
       </w:pPr>
-      <w:hyperlink w:anchor="_Toc229583544" w:history="1">
+      <w:hyperlink w:anchor="_Toc229731019" w:history="1">
         <w:r>
           <w:rPr>
             <w:rStyle w:val="Hyperlink"/>
@@ -2964,7 +2982,7 @@
             <w:noProof/>
             <w:webHidden/>
           </w:rPr>
-          <w:instrText xml:space="preserve"> PAGEREF _Toc229583544 \h </w:instrText>
+          <w:instrText xml:space="preserve"> PAGEREF _Toc229731019 \h </w:instrText>
         </w:r>
         <w:r>
           <w:rPr>
@@ -3010,7 +3028,7 @@
           <w14:ligatures w14:val="standardContextual"/>
         </w:rPr>
       </w:pPr>
-      <w:hyperlink w:anchor="_Toc229583545" w:history="1">
+      <w:hyperlink w:anchor="_Toc229731020" w:history="1">
         <w:r>
           <w:rPr>
             <w:rStyle w:val="Hyperlink"/>
@@ -3058,7 +3076,7 @@
             <w:noProof/>
             <w:webHidden/>
           </w:rPr>
-          <w:instrText xml:space="preserve"> PAGEREF _Toc229583545 \h </w:instrText>
+          <w:instrText xml:space="preserve"> PAGEREF _Toc229731020 \h </w:instrText>
         </w:r>
         <w:r>
           <w:rPr>
@@ -3104,7 +3122,7 @@
           <w14:ligatures w14:val="standardContextual"/>
         </w:rPr>
       </w:pPr>
-      <w:hyperlink w:anchor="_Toc229583546" w:history="1">
+      <w:hyperlink w:anchor="_Toc229731021" w:history="1">
         <w:r>
           <w:rPr>
             <w:rStyle w:val="Hyperlink"/>
@@ -3152,7 +3170,7 @@
             <w:noProof/>
             <w:webHidden/>
           </w:rPr>
-          <w:instrText xml:space="preserve"> PAGEREF _Toc229583546 \h </w:instrText>
+          <w:instrText xml:space="preserve"> PAGEREF _Toc229731021 \h </w:instrText>
         </w:r>
         <w:r>
           <w:rPr>
@@ -3195,7 +3213,7 @@
           <w14:ligatures w14:val="standardContextual"/>
         </w:rPr>
       </w:pPr>
-      <w:hyperlink w:anchor="_Toc229583547" w:history="1">
+      <w:hyperlink w:anchor="_Toc229731022" w:history="1">
         <w:r>
           <w:rPr>
             <w:rStyle w:val="Hyperlink"/>
@@ -3235,7 +3253,7 @@
           <w:rPr>
             <w:webHidden/>
           </w:rPr>
-          <w:instrText xml:space="preserve"> PAGEREF _Toc229583547 \h </w:instrText>
+          <w:instrText xml:space="preserve"> PAGEREF _Toc229731022 \h </w:instrText>
         </w:r>
         <w:r>
           <w:rPr>
@@ -3274,7 +3292,7 @@
           <w14:ligatures w14:val="standardContextual"/>
         </w:rPr>
       </w:pPr>
-      <w:hyperlink w:anchor="_Toc229583548" w:history="1">
+      <w:hyperlink w:anchor="_Toc229731023" w:history="1">
         <w:r>
           <w:rPr>
             <w:rStyle w:val="Hyperlink"/>
@@ -3314,7 +3332,7 @@
           <w:rPr>
             <w:webHidden/>
           </w:rPr>
-          <w:instrText xml:space="preserve"> PAGEREF _Toc229583548 \h </w:instrText>
+          <w:instrText xml:space="preserve"> PAGEREF _Toc229731023 \h </w:instrText>
         </w:r>
         <w:r>
           <w:rPr>
@@ -3353,7 +3371,7 @@
           <w14:ligatures w14:val="standardContextual"/>
         </w:rPr>
       </w:pPr>
-      <w:hyperlink w:anchor="_Toc229583549" w:history="1">
+      <w:hyperlink w:anchor="_Toc229731024" w:history="1">
         <w:r>
           <w:rPr>
             <w:rStyle w:val="Hyperlink"/>
@@ -3393,7 +3411,7 @@
           <w:rPr>
             <w:webHidden/>
           </w:rPr>
-          <w:instrText xml:space="preserve"> PAGEREF _Toc229583549 \h </w:instrText>
+          <w:instrText xml:space="preserve"> PAGEREF _Toc229731024 \h </w:instrText>
         </w:r>
         <w:r>
           <w:rPr>
@@ -3432,7 +3450,7 @@
           <w14:ligatures w14:val="standardContextual"/>
         </w:rPr>
       </w:pPr>
-      <w:hyperlink w:anchor="_Toc229583550" w:history="1">
+      <w:hyperlink w:anchor="_Toc229731025" w:history="1">
         <w:r>
           <w:rPr>
             <w:rStyle w:val="Hyperlink"/>
@@ -3472,7 +3490,7 @@
           <w:rPr>
             <w:webHidden/>
           </w:rPr>
-          <w:instrText xml:space="preserve"> PAGEREF _Toc229583550 \h </w:instrText>
+          <w:instrText xml:space="preserve"> PAGEREF _Toc229731025 \h </w:instrText>
         </w:r>
         <w:r>
           <w:rPr>
@@ -3511,7 +3529,7 @@
           <w14:ligatures w14:val="standardContextual"/>
         </w:rPr>
       </w:pPr>
-      <w:hyperlink w:anchor="_Toc229583551" w:history="1">
+      <w:hyperlink w:anchor="_Toc229731026" w:history="1">
         <w:r>
           <w:rPr>
             <w:rStyle w:val="Hyperlink"/>
@@ -3551,7 +3569,7 @@
           <w:rPr>
             <w:webHidden/>
           </w:rPr>
-          <w:instrText xml:space="preserve"> PAGEREF _Toc229583551 \h </w:instrText>
+          <w:instrText xml:space="preserve"> PAGEREF _Toc229731026 \h </w:instrText>
         </w:r>
         <w:r>
           <w:rPr>
@@ -3568,7 +3586,7 @@
           <w:rPr>
             <w:webHidden/>
           </w:rPr>
-          <w:t>11</w:t>
+          <w:t>12</w:t>
         </w:r>
         <w:r>
           <w:rPr>
@@ -3590,7 +3608,7 @@
           <w14:ligatures w14:val="standardContextual"/>
         </w:rPr>
       </w:pPr>
-      <w:hyperlink w:anchor="_Toc229583552" w:history="1">
+      <w:hyperlink w:anchor="_Toc229731027" w:history="1">
         <w:r>
           <w:rPr>
             <w:rStyle w:val="Hyperlink"/>
@@ -3630,7 +3648,7 @@
           <w:rPr>
             <w:webHidden/>
           </w:rPr>
-          <w:instrText xml:space="preserve"> PAGEREF _Toc229583552 \h </w:instrText>
+          <w:instrText xml:space="preserve"> PAGEREF _Toc229731027 \h </w:instrText>
         </w:r>
         <w:r>
           <w:rPr>
@@ -3669,7 +3687,7 @@
           <w14:ligatures w14:val="standardContextual"/>
         </w:rPr>
       </w:pPr>
-      <w:hyperlink w:anchor="_Toc229583553" w:history="1">
+      <w:hyperlink w:anchor="_Toc229731028" w:history="1">
         <w:r>
           <w:rPr>
             <w:rStyle w:val="Hyperlink"/>
@@ -3709,7 +3727,7 @@
           <w:rPr>
             <w:webHidden/>
           </w:rPr>
-          <w:instrText xml:space="preserve"> PAGEREF _Toc229583553 \h </w:instrText>
+          <w:instrText xml:space="preserve"> PAGEREF _Toc229731028 \h </w:instrText>
         </w:r>
         <w:r>
           <w:rPr>
@@ -3726,7 +3744,7 @@
           <w:rPr>
             <w:webHidden/>
           </w:rPr>
-          <w:t>12</w:t>
+          <w:t>13</w:t>
         </w:r>
         <w:r>
           <w:rPr>
@@ -3748,7 +3766,7 @@
           <w14:ligatures w14:val="standardContextual"/>
         </w:rPr>
       </w:pPr>
-      <w:hyperlink w:anchor="_Toc229583554" w:history="1">
+      <w:hyperlink w:anchor="_Toc229731029" w:history="1">
         <w:r>
           <w:rPr>
             <w:rStyle w:val="Hyperlink"/>
@@ -3788,7 +3806,7 @@
           <w:rPr>
             <w:webHidden/>
           </w:rPr>
-          <w:instrText xml:space="preserve"> PAGEREF _Toc229583554 \h </w:instrText>
+          <w:instrText xml:space="preserve"> PAGEREF _Toc229731029 \h </w:instrText>
         </w:r>
         <w:r>
           <w:rPr>
@@ -3805,7 +3823,7 @@
           <w:rPr>
             <w:webHidden/>
           </w:rPr>
-          <w:t>12</w:t>
+          <w:t>13</w:t>
         </w:r>
         <w:r>
           <w:rPr>
@@ -3827,7 +3845,7 @@
           <w14:ligatures w14:val="standardContextual"/>
         </w:rPr>
       </w:pPr>
-      <w:hyperlink w:anchor="_Toc229583555" w:history="1">
+      <w:hyperlink w:anchor="_Toc229731030" w:history="1">
         <w:r>
           <w:rPr>
             <w:rStyle w:val="Hyperlink"/>
@@ -3867,7 +3885,7 @@
           <w:rPr>
             <w:webHidden/>
           </w:rPr>
-          <w:instrText xml:space="preserve"> PAGEREF _Toc229583555 \h </w:instrText>
+          <w:instrText xml:space="preserve"> PAGEREF _Toc229731030 \h </w:instrText>
         </w:r>
         <w:r>
           <w:rPr>
@@ -3906,7 +3924,7 @@
           <w14:ligatures w14:val="standardContextual"/>
         </w:rPr>
       </w:pPr>
-      <w:hyperlink w:anchor="_Toc229583556" w:history="1">
+      <w:hyperlink w:anchor="_Toc229731031" w:history="1">
         <w:r>
           <w:rPr>
             <w:rStyle w:val="Hyperlink"/>
@@ -3946,7 +3964,7 @@
           <w:rPr>
             <w:webHidden/>
           </w:rPr>
-          <w:instrText xml:space="preserve"> PAGEREF _Toc229583556 \h </w:instrText>
+          <w:instrText xml:space="preserve"> PAGEREF _Toc229731031 \h </w:instrText>
         </w:r>
         <w:r>
           <w:rPr>
@@ -3963,7 +3981,7 @@
           <w:rPr>
             <w:webHidden/>
           </w:rPr>
-          <w:t>13</w:t>
+          <w:t>14</w:t>
         </w:r>
         <w:r>
           <w:rPr>
@@ -3985,7 +4003,7 @@
           <w14:ligatures w14:val="standardContextual"/>
         </w:rPr>
       </w:pPr>
-      <w:hyperlink w:anchor="_Toc229583557" w:history="1">
+      <w:hyperlink w:anchor="_Toc229731032" w:history="1">
         <w:r>
           <w:rPr>
             <w:rStyle w:val="Hyperlink"/>
@@ -4025,7 +4043,7 @@
           <w:rPr>
             <w:webHidden/>
           </w:rPr>
-          <w:instrText xml:space="preserve"> PAGEREF _Toc229583557 \h </w:instrText>
+          <w:instrText xml:space="preserve"> PAGEREF _Toc229731032 \h </w:instrText>
         </w:r>
         <w:r>
           <w:rPr>
@@ -4042,7 +4060,7 @@
           <w:rPr>
             <w:webHidden/>
           </w:rPr>
-          <w:t>13</w:t>
+          <w:t>14</w:t>
         </w:r>
         <w:r>
           <w:rPr>
@@ -4064,7 +4082,7 @@
           <w14:ligatures w14:val="standardContextual"/>
         </w:rPr>
       </w:pPr>
-      <w:hyperlink w:anchor="_Toc229583558" w:history="1">
+      <w:hyperlink w:anchor="_Toc229731033" w:history="1">
         <w:r>
           <w:rPr>
             <w:rStyle w:val="Hyperlink"/>
@@ -4104,7 +4122,7 @@
           <w:rPr>
             <w:webHidden/>
           </w:rPr>
-          <w:instrText xml:space="preserve"> PAGEREF _Toc229583558 \h </w:instrText>
+          <w:instrText xml:space="preserve"> PAGEREF _Toc229731033 \h </w:instrText>
         </w:r>
         <w:r>
           <w:rPr>
@@ -4121,7 +4139,7 @@
           <w:rPr>
             <w:webHidden/>
           </w:rPr>
-          <w:t>14</w:t>
+          <w:t>15</w:t>
         </w:r>
         <w:r>
           <w:rPr>
@@ -4143,7 +4161,7 @@
           <w14:ligatures w14:val="standardContextual"/>
         </w:rPr>
       </w:pPr>
-      <w:hyperlink w:anchor="_Toc229583559" w:history="1">
+      <w:hyperlink w:anchor="_Toc229731034" w:history="1">
         <w:r>
           <w:rPr>
             <w:rStyle w:val="Hyperlink"/>
@@ -4183,7 +4201,7 @@
           <w:rPr>
             <w:webHidden/>
           </w:rPr>
-          <w:instrText xml:space="preserve"> PAGEREF _Toc229583559 \h </w:instrText>
+          <w:instrText xml:space="preserve"> PAGEREF _Toc229731034 \h </w:instrText>
         </w:r>
         <w:r>
           <w:rPr>
@@ -4200,7 +4218,7 @@
           <w:rPr>
             <w:webHidden/>
           </w:rPr>
-          <w:t>14</w:t>
+          <w:t>15</w:t>
         </w:r>
         <w:r>
           <w:rPr>
@@ -4222,7 +4240,7 @@
           <w14:ligatures w14:val="standardContextual"/>
         </w:rPr>
       </w:pPr>
-      <w:hyperlink w:anchor="_Toc229583560" w:history="1">
+      <w:hyperlink w:anchor="_Toc229731035" w:history="1">
         <w:r>
           <w:rPr>
             <w:rStyle w:val="Hyperlink"/>
@@ -4262,7 +4280,7 @@
           <w:rPr>
             <w:webHidden/>
           </w:rPr>
-          <w:instrText xml:space="preserve"> PAGEREF _Toc229583560 \h </w:instrText>
+          <w:instrText xml:space="preserve"> PAGEREF _Toc229731035 \h </w:instrText>
         </w:r>
         <w:r>
           <w:rPr>
@@ -4279,7 +4297,7 @@
           <w:rPr>
             <w:webHidden/>
           </w:rPr>
-          <w:t>14</w:t>
+          <w:t>15</w:t>
         </w:r>
         <w:r>
           <w:rPr>
@@ -4304,7 +4322,7 @@
           <w14:ligatures w14:val="standardContextual"/>
         </w:rPr>
       </w:pPr>
-      <w:hyperlink w:anchor="_Toc229583561" w:history="1">
+      <w:hyperlink w:anchor="_Toc229731036" w:history="1">
         <w:r>
           <w:rPr>
             <w:rStyle w:val="Hyperlink"/>
@@ -4352,7 +4370,7 @@
             <w:noProof/>
             <w:webHidden/>
           </w:rPr>
-          <w:instrText xml:space="preserve"> PAGEREF _Toc229583561 \h </w:instrText>
+          <w:instrText xml:space="preserve"> PAGEREF _Toc229731036 \h </w:instrText>
         </w:r>
         <w:r>
           <w:rPr>
@@ -4372,7 +4390,7 @@
             <w:noProof/>
             <w:webHidden/>
           </w:rPr>
-          <w:t>15</w:t>
+          <w:t>16</w:t>
         </w:r>
         <w:r>
           <w:rPr>
@@ -4398,7 +4416,7 @@
           <w14:ligatures w14:val="standardContextual"/>
         </w:rPr>
       </w:pPr>
-      <w:hyperlink w:anchor="_Toc229583562" w:history="1">
+      <w:hyperlink w:anchor="_Toc229731037" w:history="1">
         <w:r>
           <w:rPr>
             <w:rStyle w:val="Hyperlink"/>
@@ -4446,7 +4464,7 @@
             <w:noProof/>
             <w:webHidden/>
           </w:rPr>
-          <w:instrText xml:space="preserve"> PAGEREF _Toc229583562 \h </w:instrText>
+          <w:instrText xml:space="preserve"> PAGEREF _Toc229731037 \h </w:instrText>
         </w:r>
         <w:r>
           <w:rPr>
@@ -4466,7 +4484,7 @@
             <w:noProof/>
             <w:webHidden/>
           </w:rPr>
-          <w:t>17</w:t>
+          <w:t>18</w:t>
         </w:r>
         <w:r>
           <w:rPr>
@@ -4492,7 +4510,7 @@
           <w14:ligatures w14:val="standardContextual"/>
         </w:rPr>
       </w:pPr>
-      <w:hyperlink w:anchor="_Toc229583563" w:history="1">
+      <w:hyperlink w:anchor="_Toc229731038" w:history="1">
         <w:r>
           <w:rPr>
             <w:rStyle w:val="Hyperlink"/>
@@ -4540,7 +4558,7 @@
             <w:noProof/>
             <w:webHidden/>
           </w:rPr>
-          <w:instrText xml:space="preserve"> PAGEREF _Toc229583563 \h </w:instrText>
+          <w:instrText xml:space="preserve"> PAGEREF _Toc229731038 \h </w:instrText>
         </w:r>
         <w:r>
           <w:rPr>
@@ -4560,7 +4578,7 @@
             <w:noProof/>
             <w:webHidden/>
           </w:rPr>
-          <w:t>17</w:t>
+          <w:t>18</w:t>
         </w:r>
         <w:r>
           <w:rPr>
@@ -4588,7 +4606,7 @@
       <w:pPr>
         <w:pStyle w:val="Heading1"/>
       </w:pPr>
-      <w:bookmarkStart w:id="0" w:name="_Toc229583513"/>
+      <w:bookmarkStart w:id="0" w:name="_Toc229730988"/>
       <w:r>
         <w:lastRenderedPageBreak/>
         <w:t>Introduction</w:t>
@@ -4612,7 +4630,7 @@
       <w:pPr>
         <w:pStyle w:val="Heading1"/>
       </w:pPr>
-      <w:bookmarkStart w:id="1" w:name="_Toc229583514"/>
+      <w:bookmarkStart w:id="1" w:name="_Toc229730989"/>
       <w:r>
         <w:t>Purpose</w:t>
       </w:r>
@@ -4678,7 +4696,7 @@
       <w:pPr>
         <w:pStyle w:val="Heading1"/>
       </w:pPr>
-      <w:bookmarkStart w:id="2" w:name="_Toc229583515"/>
+      <w:bookmarkStart w:id="2" w:name="_Toc229730990"/>
       <w:r>
         <w:t>Scope</w:t>
       </w:r>
@@ -4688,7 +4706,7 @@
       <w:pPr>
         <w:pStyle w:val="Heading2"/>
       </w:pPr>
-      <w:bookmarkStart w:id="3" w:name="_Toc229583516"/>
+      <w:bookmarkStart w:id="3" w:name="_Toc229730991"/>
       <w:r>
         <w:t>In Scope</w:t>
       </w:r>
@@ -4760,8 +4778,13 @@
         <w:pStyle w:val="ListParagraph"/>
       </w:pPr>
       <w:r>
-        <w:t>Game Over and Night Complete states</w:t>
-      </w:r>
+        <w:t xml:space="preserve">Game Over and Night Complete </w:t>
+      </w:r>
+      <w:proofErr w:type="gramStart"/>
+      <w:r>
+        <w:t>states</w:t>
+      </w:r>
+      <w:proofErr w:type="gramEnd"/>
     </w:p>
     <w:p>
       <w:pPr>
@@ -4808,7 +4831,7 @@
       <w:pPr>
         <w:pStyle w:val="Heading2"/>
       </w:pPr>
-      <w:bookmarkStart w:id="4" w:name="_Toc229583517"/>
+      <w:bookmarkStart w:id="4" w:name="_Toc229730992"/>
       <w:r>
         <w:t>Out of Scope</w:t>
       </w:r>
@@ -4871,7 +4894,7 @@
       <w:pPr>
         <w:pStyle w:val="Heading1"/>
       </w:pPr>
-      <w:bookmarkStart w:id="5" w:name="_Toc229583518"/>
+      <w:bookmarkStart w:id="5" w:name="_Toc229730993"/>
       <w:r>
         <w:lastRenderedPageBreak/>
         <w:t>References</w:t>
@@ -5156,7 +5179,7 @@
       <w:pPr>
         <w:pStyle w:val="Heading1"/>
       </w:pPr>
-      <w:bookmarkStart w:id="6" w:name="_Toc229583519"/>
+      <w:bookmarkStart w:id="6" w:name="_Toc229730994"/>
       <w:r>
         <w:t>Test Objectives</w:t>
       </w:r>
@@ -5228,8 +5251,13 @@
         <w:pStyle w:val="ListParagraph"/>
       </w:pPr>
       <w:r>
-        <w:t>Verify stable execution without crashes or freezes</w:t>
-      </w:r>
+        <w:t xml:space="preserve">Verify stable execution without crashes or </w:t>
+      </w:r>
+      <w:proofErr w:type="gramStart"/>
+      <w:r>
+        <w:t>freezes</w:t>
+      </w:r>
+      <w:proofErr w:type="gramEnd"/>
     </w:p>
     <w:p>
       <w:pPr>
@@ -5251,7 +5279,7 @@
       <w:pPr>
         <w:pStyle w:val="Heading1"/>
       </w:pPr>
-      <w:bookmarkStart w:id="7" w:name="_Toc229583520"/>
+      <w:bookmarkStart w:id="7" w:name="_Toc229730995"/>
       <w:r>
         <w:t>Test Environment</w:t>
       </w:r>
@@ -5261,7 +5289,7 @@
       <w:pPr>
         <w:pStyle w:val="Heading2"/>
       </w:pPr>
-      <w:bookmarkStart w:id="8" w:name="_Toc229583521"/>
+      <w:bookmarkStart w:id="8" w:name="_Toc229730996"/>
       <w:r>
         <w:t>Hardware Requirements</w:t>
       </w:r>
@@ -5303,7 +5331,7 @@
       <w:pPr>
         <w:pStyle w:val="Heading2"/>
       </w:pPr>
-      <w:bookmarkStart w:id="9" w:name="_Toc229583522"/>
+      <w:bookmarkStart w:id="9" w:name="_Toc229730997"/>
       <w:r>
         <w:t>Software Requirements</w:t>
       </w:r>
@@ -5337,7 +5365,7 @@
       <w:pPr>
         <w:pStyle w:val="Heading2"/>
       </w:pPr>
-      <w:bookmarkStart w:id="10" w:name="_Toc229583523"/>
+      <w:bookmarkStart w:id="10" w:name="_Toc229730998"/>
       <w:r>
         <w:lastRenderedPageBreak/>
         <w:t>Build Under Test</w:t>
@@ -5380,7 +5408,7 @@
       <w:pPr>
         <w:pStyle w:val="Heading1"/>
       </w:pPr>
-      <w:bookmarkStart w:id="11" w:name="_Toc229583524"/>
+      <w:bookmarkStart w:id="11" w:name="_Toc229730999"/>
       <w:r>
         <w:t>Test Types</w:t>
       </w:r>
@@ -5390,7 +5418,7 @@
       <w:pPr>
         <w:pStyle w:val="Heading2"/>
       </w:pPr>
-      <w:bookmarkStart w:id="12" w:name="_Toc229583525"/>
+      <w:bookmarkStart w:id="12" w:name="_Toc229731000"/>
       <w:r>
         <w:t>Functional Testing</w:t>
       </w:r>
@@ -5405,7 +5433,7 @@
       <w:pPr>
         <w:pStyle w:val="Heading2"/>
       </w:pPr>
-      <w:bookmarkStart w:id="13" w:name="_Toc229583526"/>
+      <w:bookmarkStart w:id="13" w:name="_Toc229731001"/>
       <w:r>
         <w:t>Integration Testing</w:t>
       </w:r>
@@ -5420,7 +5448,7 @@
       <w:pPr>
         <w:pStyle w:val="Heading2"/>
       </w:pPr>
-      <w:bookmarkStart w:id="14" w:name="_Toc229583527"/>
+      <w:bookmarkStart w:id="14" w:name="_Toc229731002"/>
       <w:r>
         <w:t>User Interface Testing</w:t>
       </w:r>
@@ -5435,7 +5463,7 @@
       <w:pPr>
         <w:pStyle w:val="Heading2"/>
       </w:pPr>
-      <w:bookmarkStart w:id="15" w:name="_Toc229583528"/>
+      <w:bookmarkStart w:id="15" w:name="_Toc229731003"/>
       <w:r>
         <w:t>Performance Testing</w:t>
       </w:r>
@@ -5450,7 +5478,7 @@
       <w:pPr>
         <w:pStyle w:val="Heading2"/>
       </w:pPr>
-      <w:bookmarkStart w:id="16" w:name="_Toc229583529"/>
+      <w:bookmarkStart w:id="16" w:name="_Toc229731004"/>
       <w:r>
         <w:t>Regression Testing</w:t>
       </w:r>
@@ -5471,7 +5499,7 @@
       <w:pPr>
         <w:pStyle w:val="Heading2"/>
       </w:pPr>
-      <w:bookmarkStart w:id="17" w:name="_Toc229583530"/>
+      <w:bookmarkStart w:id="17" w:name="_Toc229731005"/>
       <w:r>
         <w:t>Usability Testing</w:t>
       </w:r>
@@ -5486,7 +5514,7 @@
       <w:pPr>
         <w:pStyle w:val="Heading2"/>
       </w:pPr>
-      <w:bookmarkStart w:id="18" w:name="_Toc229583531"/>
+      <w:bookmarkStart w:id="18" w:name="_Toc229731006"/>
       <w:r>
         <w:t>Build Verification Testing</w:t>
       </w:r>
@@ -5501,7 +5529,7 @@
       <w:pPr>
         <w:pStyle w:val="Heading1"/>
       </w:pPr>
-      <w:bookmarkStart w:id="19" w:name="_Toc229583532"/>
+      <w:bookmarkStart w:id="19" w:name="_Toc229731007"/>
       <w:r>
         <w:t>Test Approach</w:t>
       </w:r>
@@ -5598,7 +5626,7 @@
       <w:pPr>
         <w:pStyle w:val="Heading1"/>
       </w:pPr>
-      <w:bookmarkStart w:id="20" w:name="_Toc229583533"/>
+      <w:bookmarkStart w:id="20" w:name="_Toc229731008"/>
       <w:r>
         <w:lastRenderedPageBreak/>
         <w:t>Roles and Responsibilities</w:t>
@@ -5839,7 +5867,7 @@
       <w:pPr>
         <w:pStyle w:val="Heading1"/>
       </w:pPr>
-      <w:bookmarkStart w:id="21" w:name="_Toc229583534"/>
+      <w:bookmarkStart w:id="21" w:name="_Toc229731009"/>
       <w:r>
         <w:t>Entry and Exit Criteria</w:t>
       </w:r>
@@ -5852,7 +5880,7 @@
       <w:pPr>
         <w:pStyle w:val="Heading2"/>
       </w:pPr>
-      <w:bookmarkStart w:id="22" w:name="_Toc229583535"/>
+      <w:bookmarkStart w:id="22" w:name="_Toc229731010"/>
       <w:r>
         <w:t>Entry Criteria</w:t>
       </w:r>
@@ -5899,7 +5927,7 @@
       <w:pPr>
         <w:pStyle w:val="Heading2"/>
       </w:pPr>
-      <w:bookmarkStart w:id="23" w:name="_Toc229583536"/>
+      <w:bookmarkStart w:id="23" w:name="_Toc229731011"/>
       <w:r>
         <w:t>Exit Criteria</w:t>
       </w:r>
@@ -5954,7 +5982,7 @@
       <w:pPr>
         <w:pStyle w:val="Heading1"/>
       </w:pPr>
-      <w:bookmarkStart w:id="24" w:name="_Toc229583537"/>
+      <w:bookmarkStart w:id="24" w:name="_Toc229731012"/>
       <w:r>
         <w:t>Defect Management Process</w:t>
       </w:r>
@@ -5967,7 +5995,7 @@
       <w:pPr>
         <w:pStyle w:val="Heading2"/>
       </w:pPr>
-      <w:bookmarkStart w:id="25" w:name="_Toc229583538"/>
+      <w:bookmarkStart w:id="25" w:name="_Toc229731013"/>
       <w:r>
         <w:t>Defect Lifecycle</w:t>
       </w:r>
@@ -6002,8 +6030,13 @@
         <w:pStyle w:val="ListParagraph"/>
       </w:pPr>
       <w:r>
-        <w:t>Developer investigates and fixes issue</w:t>
-      </w:r>
+        <w:t xml:space="preserve">Developer investigates and fixes </w:t>
+      </w:r>
+      <w:proofErr w:type="gramStart"/>
+      <w:r>
+        <w:t>issue</w:t>
+      </w:r>
+      <w:proofErr w:type="gramEnd"/>
     </w:p>
     <w:p>
       <w:pPr>
@@ -6025,7 +6058,7 @@
       <w:pPr>
         <w:pStyle w:val="Heading2"/>
       </w:pPr>
-      <w:bookmarkStart w:id="26" w:name="_Toc229583539"/>
+      <w:bookmarkStart w:id="26" w:name="_Toc229731014"/>
       <w:r>
         <w:lastRenderedPageBreak/>
         <w:t>Severity Levels</w:t>
@@ -6235,7 +6268,7 @@
       <w:pPr>
         <w:pStyle w:val="Heading1"/>
       </w:pPr>
-      <w:bookmarkStart w:id="27" w:name="_Toc229583540"/>
+      <w:bookmarkStart w:id="27" w:name="_Toc229731015"/>
       <w:r>
         <w:t>Suspension and Resumption Criteria</w:t>
       </w:r>
@@ -6245,7 +6278,7 @@
       <w:pPr>
         <w:pStyle w:val="Heading2"/>
       </w:pPr>
-      <w:bookmarkStart w:id="28" w:name="_Toc229583541"/>
+      <w:bookmarkStart w:id="28" w:name="_Toc229731016"/>
       <w:r>
         <w:t>Testing May Be Suspended If:</w:t>
       </w:r>
@@ -6287,7 +6320,7 @@
       <w:pPr>
         <w:pStyle w:val="Heading2"/>
       </w:pPr>
-      <w:bookmarkStart w:id="29" w:name="_Toc229583542"/>
+      <w:bookmarkStart w:id="29" w:name="_Toc229731017"/>
       <w:r>
         <w:t>Testing Will Resume When:</w:t>
       </w:r>
@@ -6321,7 +6354,7 @@
       <w:pPr>
         <w:pStyle w:val="Heading1"/>
       </w:pPr>
-      <w:bookmarkStart w:id="30" w:name="_Toc229583543"/>
+      <w:bookmarkStart w:id="30" w:name="_Toc229731018"/>
       <w:r>
         <w:t>Risks and Mitigation</w:t>
       </w:r>
@@ -6366,7 +6399,7 @@
       <w:pPr>
         <w:pStyle w:val="Heading1"/>
       </w:pPr>
-      <w:bookmarkStart w:id="31" w:name="_Toc229583544"/>
+      <w:bookmarkStart w:id="31" w:name="_Toc229731019"/>
       <w:r>
         <w:t>Deliverables</w:t>
       </w:r>
@@ -6435,7 +6468,7 @@
       <w:pPr>
         <w:pStyle w:val="Heading1"/>
       </w:pPr>
-      <w:bookmarkStart w:id="32" w:name="_Toc229583545"/>
+      <w:bookmarkStart w:id="32" w:name="_Toc229731020"/>
       <w:r>
         <w:lastRenderedPageBreak/>
         <w:t>Test Schedule</w:t>
@@ -6675,7 +6708,7 @@
       <w:pPr>
         <w:pStyle w:val="Heading1"/>
       </w:pPr>
-      <w:bookmarkStart w:id="33" w:name="_Toc229583546"/>
+      <w:bookmarkStart w:id="33" w:name="_Toc229731021"/>
       <w:r>
         <w:t>Test Cases</w:t>
       </w:r>
@@ -6685,7 +6718,7 @@
       <w:pPr>
         <w:pStyle w:val="Heading2"/>
       </w:pPr>
-      <w:bookmarkStart w:id="34" w:name="_Toc229583547"/>
+      <w:bookmarkStart w:id="34" w:name="_Toc229731022"/>
       <w:r>
         <w:t>TC-001 – Launch Application</w:t>
       </w:r>
@@ -6998,6 +7031,77 @@
               <w:spacing w:after="0"/>
               <w:cnfStyle w:val="000000000000" w:firstRow="0" w:lastRow="0" w:firstColumn="0" w:lastColumn="0" w:oddVBand="0" w:evenVBand="0" w:oddHBand="0" w:evenHBand="0" w:firstRowFirstColumn="0" w:firstRowLastColumn="0" w:lastRowFirstColumn="0" w:lastRowLastColumn="0"/>
             </w:pPr>
+            <w:r>
+              <w:t>5/15/26: Successfully Tested</w:t>
+            </w:r>
+          </w:p>
+        </w:tc>
+      </w:tr>
+      <w:tr>
+        <w:trPr>
+          <w:cnfStyle w:val="000000100000" w:firstRow="0" w:lastRow="0" w:firstColumn="0" w:lastColumn="0" w:oddVBand="0" w:evenVBand="0" w:oddHBand="1" w:evenHBand="0" w:firstRowFirstColumn="0" w:firstRowLastColumn="0" w:lastRowFirstColumn="0" w:lastRowLastColumn="0"/>
+        </w:trPr>
+        <w:tc>
+          <w:tcPr>
+            <w:cnfStyle w:val="001000000000" w:firstRow="0" w:lastRow="0" w:firstColumn="1" w:lastColumn="0" w:oddVBand="0" w:evenVBand="0" w:oddHBand="0" w:evenHBand="0" w:firstRowFirstColumn="0" w:firstRowLastColumn="0" w:lastRowFirstColumn="0" w:lastRowLastColumn="0"/>
+            <w:tcW w:w="2835" w:type="dxa"/>
+          </w:tcPr>
+          <w:p>
+            <w:pPr>
+              <w:spacing w:after="0"/>
+            </w:pPr>
+            <w:r>
+              <w:t>Test Image</w:t>
+            </w:r>
+          </w:p>
+        </w:tc>
+        <w:tc>
+          <w:tcPr>
+            <w:tcW w:w="4275" w:type="dxa"/>
+          </w:tcPr>
+          <w:p>
+            <w:pPr>
+              <w:spacing w:after="0"/>
+              <w:jc w:val="center"/>
+              <w:cnfStyle w:val="000000100000" w:firstRow="0" w:lastRow="0" w:firstColumn="0" w:lastColumn="0" w:oddVBand="0" w:evenVBand="0" w:oddHBand="1" w:evenHBand="0" w:firstRowFirstColumn="0" w:firstRowLastColumn="0" w:lastRowFirstColumn="0" w:lastRowLastColumn="0"/>
+            </w:pPr>
+            <w:r>
+              <w:drawing>
+                <wp:inline distT="0" distB="0" distL="0" distR="0" wp14:anchorId="3D1BBEB7" wp14:editId="27F3BC94">
+                  <wp:extent cx="786384" cy="685800"/>
+                  <wp:effectExtent l="0" t="0" r="0" b="0"/>
+                  <wp:docPr id="1030987474" name="Picture 1"/>
+                  <wp:cNvGraphicFramePr>
+                    <a:graphicFrameLocks xmlns:a="http://schemas.openxmlformats.org/drawingml/2006/main" noChangeAspect="1"/>
+                  </wp:cNvGraphicFramePr>
+                  <a:graphic xmlns:a="http://schemas.openxmlformats.org/drawingml/2006/main">
+                    <a:graphicData uri="http://schemas.openxmlformats.org/drawingml/2006/picture">
+                      <pic:pic xmlns:pic="http://schemas.openxmlformats.org/drawingml/2006/picture">
+                        <pic:nvPicPr>
+                          <pic:cNvPr id="1030987474" name=""/>
+                          <pic:cNvPicPr/>
+                        </pic:nvPicPr>
+                        <pic:blipFill>
+                          <a:blip r:embed="rId7"/>
+                          <a:stretch>
+                            <a:fillRect/>
+                          </a:stretch>
+                        </pic:blipFill>
+                        <pic:spPr>
+                          <a:xfrm>
+                            <a:off x="0" y="0"/>
+                            <a:ext cx="786384" cy="685800"/>
+                          </a:xfrm>
+                          <a:prstGeom prst="rect">
+                            <a:avLst/>
+                          </a:prstGeom>
+                        </pic:spPr>
+                      </pic:pic>
+                    </a:graphicData>
+                  </a:graphic>
+                </wp:inline>
+              </w:drawing>
+            </w:r>
           </w:p>
         </w:tc>
       </w:tr>
@@ -7007,7 +7111,7 @@
       <w:pPr>
         <w:pStyle w:val="Heading2"/>
       </w:pPr>
-      <w:bookmarkStart w:id="35" w:name="_Toc229583548"/>
+      <w:bookmarkStart w:id="35" w:name="_Toc229731023"/>
       <w:r>
         <w:t>TC-002 – Start New Game</w:t>
       </w:r>
@@ -7282,6 +7386,7 @@
               <w:spacing w:before="60" w:after="60"/>
             </w:pPr>
             <w:r>
+              <w:lastRenderedPageBreak/>
               <w:t>Priority</w:t>
             </w:r>
           </w:p>
@@ -7326,6 +7431,80 @@
               <w:spacing w:before="60" w:after="60"/>
               <w:cnfStyle w:val="000000000000" w:firstRow="0" w:lastRow="0" w:firstColumn="0" w:lastColumn="0" w:oddVBand="0" w:evenVBand="0" w:oddHBand="0" w:evenHBand="0" w:firstRowFirstColumn="0" w:firstRowLastColumn="0" w:lastRowFirstColumn="0" w:lastRowLastColumn="0"/>
             </w:pPr>
+            <w:r>
+              <w:t>5/15/26: Successfully Tested</w:t>
+            </w:r>
+            <w:r>
+              <w:t>. Game loads and game plays correctly.</w:t>
+            </w:r>
+          </w:p>
+        </w:tc>
+      </w:tr>
+      <w:tr>
+        <w:trPr>
+          <w:cnfStyle w:val="000000100000" w:firstRow="0" w:lastRow="0" w:firstColumn="0" w:lastColumn="0" w:oddVBand="0" w:evenVBand="0" w:oddHBand="1" w:evenHBand="0" w:firstRowFirstColumn="0" w:firstRowLastColumn="0" w:lastRowFirstColumn="0" w:lastRowLastColumn="0"/>
+        </w:trPr>
+        <w:tc>
+          <w:tcPr>
+            <w:cnfStyle w:val="001000000000" w:firstRow="0" w:lastRow="0" w:firstColumn="1" w:lastColumn="0" w:oddVBand="0" w:evenVBand="0" w:oddHBand="0" w:evenHBand="0" w:firstRowFirstColumn="0" w:firstRowLastColumn="0" w:lastRowFirstColumn="0" w:lastRowLastColumn="0"/>
+            <w:tcW w:w="2835" w:type="dxa"/>
+          </w:tcPr>
+          <w:p>
+            <w:pPr>
+              <w:spacing w:before="60" w:after="60"/>
+            </w:pPr>
+            <w:r>
+              <w:t>Test Image</w:t>
+            </w:r>
+          </w:p>
+        </w:tc>
+        <w:tc>
+          <w:tcPr>
+            <w:tcW w:w="4275" w:type="dxa"/>
+          </w:tcPr>
+          <w:p>
+            <w:pPr>
+              <w:spacing w:before="60" w:after="60"/>
+              <w:jc w:val="center"/>
+              <w:cnfStyle w:val="000000100000" w:firstRow="0" w:lastRow="0" w:firstColumn="0" w:lastColumn="0" w:oddVBand="0" w:evenVBand="0" w:oddHBand="1" w:evenHBand="0" w:firstRowFirstColumn="0" w:firstRowLastColumn="0" w:lastRowFirstColumn="0" w:lastRowLastColumn="0"/>
+            </w:pPr>
+            <w:r>
+              <w:drawing>
+                <wp:inline distT="0" distB="0" distL="0" distR="0" wp14:anchorId="697318CC" wp14:editId="1D61143B">
+                  <wp:extent cx="786384" cy="685800"/>
+                  <wp:effectExtent l="0" t="0" r="0" b="0"/>
+                  <wp:docPr id="443040291" name="Picture 1"/>
+                  <wp:cNvGraphicFramePr>
+                    <a:graphicFrameLocks xmlns:a="http://schemas.openxmlformats.org/drawingml/2006/main" noChangeAspect="1"/>
+                  </wp:cNvGraphicFramePr>
+                  <a:graphic xmlns:a="http://schemas.openxmlformats.org/drawingml/2006/main">
+                    <a:graphicData uri="http://schemas.openxmlformats.org/drawingml/2006/picture">
+                      <pic:pic xmlns:pic="http://schemas.openxmlformats.org/drawingml/2006/picture">
+                        <pic:nvPicPr>
+                          <pic:cNvPr id="443040291" name=""/>
+                          <pic:cNvPicPr/>
+                        </pic:nvPicPr>
+                        <pic:blipFill>
+                          <a:blip r:embed="rId8"/>
+                          <a:stretch>
+                            <a:fillRect/>
+                          </a:stretch>
+                        </pic:blipFill>
+                        <pic:spPr>
+                          <a:xfrm>
+                            <a:off x="0" y="0"/>
+                            <a:ext cx="786384" cy="685800"/>
+                          </a:xfrm>
+                          <a:prstGeom prst="rect">
+                            <a:avLst/>
+                          </a:prstGeom>
+                        </pic:spPr>
+                      </pic:pic>
+                    </a:graphicData>
+                  </a:graphic>
+                </wp:inline>
+              </w:drawing>
+            </w:r>
           </w:p>
         </w:tc>
       </w:tr>
@@ -7334,9 +7513,8 @@
       <w:pPr>
         <w:pStyle w:val="Heading2"/>
       </w:pPr>
-      <w:bookmarkStart w:id="36" w:name="_Toc229583549"/>
-      <w:r>
-        <w:lastRenderedPageBreak/>
+      <w:bookmarkStart w:id="36" w:name="_Toc229731024"/>
+      <w:r>
         <w:t>TC-003 – Sleep Meter Increases</w:t>
       </w:r>
       <w:bookmarkEnd w:id="36"/>
@@ -7654,6 +7832,93 @@
               <w:spacing w:before="60" w:after="60"/>
               <w:cnfStyle w:val="000000000000" w:firstRow="0" w:lastRow="0" w:firstColumn="0" w:lastColumn="0" w:oddVBand="0" w:evenVBand="0" w:oddHBand="0" w:evenHBand="0" w:firstRowFirstColumn="0" w:firstRowLastColumn="0" w:lastRowFirstColumn="0" w:lastRowLastColumn="0"/>
             </w:pPr>
+            <w:r>
+              <w:t>5/15/26: Successfully Tested</w:t>
+            </w:r>
+          </w:p>
+        </w:tc>
+      </w:tr>
+      <w:tr>
+        <w:trPr>
+          <w:cnfStyle w:val="000000100000" w:firstRow="0" w:lastRow="0" w:firstColumn="0" w:lastColumn="0" w:oddVBand="0" w:evenVBand="0" w:oddHBand="1" w:evenHBand="0" w:firstRowFirstColumn="0" w:firstRowLastColumn="0" w:lastRowFirstColumn="0" w:lastRowLastColumn="0"/>
+        </w:trPr>
+        <w:tc>
+          <w:tcPr>
+            <w:cnfStyle w:val="001000000000" w:firstRow="0" w:lastRow="0" w:firstColumn="1" w:lastColumn="0" w:oddVBand="0" w:evenVBand="0" w:oddHBand="0" w:evenHBand="0" w:firstRowFirstColumn="0" w:firstRowLastColumn="0" w:lastRowFirstColumn="0" w:lastRowLastColumn="0"/>
+            <w:tcW w:w="2835" w:type="dxa"/>
+          </w:tcPr>
+          <w:p>
+            <w:pPr>
+              <w:spacing w:before="60" w:after="60"/>
+            </w:pPr>
+            <w:r>
+              <w:t>Test Image</w:t>
+            </w:r>
+          </w:p>
+        </w:tc>
+        <w:tc>
+          <w:tcPr>
+            <w:tcW w:w="4275" w:type="dxa"/>
+          </w:tcPr>
+          <w:p>
+            <w:pPr>
+              <w:spacing w:before="60" w:after="60"/>
+              <w:jc w:val="center"/>
+              <w:cnfStyle w:val="000000100000" w:firstRow="0" w:lastRow="0" w:firstColumn="0" w:lastColumn="0" w:oddVBand="0" w:evenVBand="0" w:oddHBand="1" w:evenHBand="0" w:firstRowFirstColumn="0" w:firstRowLastColumn="0" w:lastRowFirstColumn="0" w:lastRowLastColumn="0"/>
+            </w:pPr>
+            <w:r>
+              <w:rPr>
+                <w:noProof/>
+              </w:rPr>
+              <w:drawing>
+                <wp:inline distT="0" distB="0" distL="0" distR="0" wp14:anchorId="0E8F5F5F" wp14:editId="57D8A3B7">
+                  <wp:extent cx="786384" cy="685800"/>
+                  <wp:effectExtent l="0" t="0" r="0" b="0"/>
+                  <wp:docPr id="1086822819" name="Picture 1"/>
+                  <wp:cNvGraphicFramePr>
+                    <a:graphicFrameLocks xmlns:a="http://schemas.openxmlformats.org/drawingml/2006/main" noChangeAspect="1"/>
+                  </wp:cNvGraphicFramePr>
+                  <a:graphic xmlns:a="http://schemas.openxmlformats.org/drawingml/2006/main">
+                    <a:graphicData uri="http://schemas.openxmlformats.org/drawingml/2006/picture">
+                      <pic:pic xmlns:pic="http://schemas.openxmlformats.org/drawingml/2006/picture">
+                        <pic:nvPicPr>
+                          <pic:cNvPr id="0" name="Picture 1"/>
+                          <pic:cNvPicPr>
+                            <a:picLocks noChangeAspect="1" noChangeArrowheads="1"/>
+                          </pic:cNvPicPr>
+                        </pic:nvPicPr>
+                        <pic:blipFill>
+                          <a:blip r:embed="rId9" cstate="print">
+                            <a:extLst>
+                              <a:ext uri="{28A0092B-C50C-407E-A947-70E740481C1C}">
+                                <a14:useLocalDpi xmlns:a14="http://schemas.microsoft.com/office/drawing/2010/main" val="0"/>
+                              </a:ext>
+                            </a:extLst>
+                          </a:blip>
+                          <a:srcRect/>
+                          <a:stretch>
+                            <a:fillRect/>
+                          </a:stretch>
+                        </pic:blipFill>
+                        <pic:spPr bwMode="auto">
+                          <a:xfrm>
+                            <a:off x="0" y="0"/>
+                            <a:ext cx="786384" cy="685800"/>
+                          </a:xfrm>
+                          <a:prstGeom prst="rect">
+                            <a:avLst/>
+                          </a:prstGeom>
+                          <a:noFill/>
+                          <a:ln>
+                            <a:noFill/>
+                          </a:ln>
+                        </pic:spPr>
+                      </pic:pic>
+                    </a:graphicData>
+                  </a:graphic>
+                </wp:inline>
+              </w:drawing>
+            </w:r>
           </w:p>
         </w:tc>
       </w:tr>
@@ -7662,7 +7927,7 @@
       <w:pPr>
         <w:pStyle w:val="Heading2"/>
       </w:pPr>
-      <w:bookmarkStart w:id="37" w:name="_Toc229583550"/>
+      <w:bookmarkStart w:id="37" w:name="_Toc229731025"/>
       <w:r>
         <w:t>TC-004 – Sleep Meter Stops</w:t>
       </w:r>
@@ -7981,6 +8246,97 @@
               <w:spacing w:before="60" w:after="60"/>
               <w:cnfStyle w:val="000000000000" w:firstRow="0" w:lastRow="0" w:firstColumn="0" w:lastColumn="0" w:oddVBand="0" w:evenVBand="0" w:oddHBand="0" w:evenHBand="0" w:firstRowFirstColumn="0" w:firstRowLastColumn="0" w:lastRowFirstColumn="0" w:lastRowLastColumn="0"/>
             </w:pPr>
+            <w:r>
+              <w:t>5/15/26: Successfully Tested</w:t>
+            </w:r>
+            <w:r>
+              <w:t>. Meter stops increasing and remains at the current value.</w:t>
+            </w:r>
+          </w:p>
+        </w:tc>
+      </w:tr>
+      <w:tr>
+        <w:trPr>
+          <w:cnfStyle w:val="000000100000" w:firstRow="0" w:lastRow="0" w:firstColumn="0" w:lastColumn="0" w:oddVBand="0" w:evenVBand="0" w:oddHBand="1" w:evenHBand="0" w:firstRowFirstColumn="0" w:firstRowLastColumn="0" w:lastRowFirstColumn="0" w:lastRowLastColumn="0"/>
+        </w:trPr>
+        <w:tc>
+          <w:tcPr>
+            <w:cnfStyle w:val="001000000000" w:firstRow="0" w:lastRow="0" w:firstColumn="1" w:lastColumn="0" w:oddVBand="0" w:evenVBand="0" w:oddHBand="0" w:evenHBand="0" w:firstRowFirstColumn="0" w:firstRowLastColumn="0" w:lastRowFirstColumn="0" w:lastRowLastColumn="0"/>
+            <w:tcW w:w="2835" w:type="dxa"/>
+          </w:tcPr>
+          <w:p>
+            <w:pPr>
+              <w:spacing w:before="60" w:after="60"/>
+            </w:pPr>
+            <w:r>
+              <w:lastRenderedPageBreak/>
+              <w:t>Test Image</w:t>
+            </w:r>
+          </w:p>
+        </w:tc>
+        <w:tc>
+          <w:tcPr>
+            <w:tcW w:w="4275" w:type="dxa"/>
+          </w:tcPr>
+          <w:p>
+            <w:pPr>
+              <w:spacing w:before="60" w:after="60"/>
+              <w:jc w:val="center"/>
+              <w:cnfStyle w:val="000000100000" w:firstRow="0" w:lastRow="0" w:firstColumn="0" w:lastColumn="0" w:oddVBand="0" w:evenVBand="0" w:oddHBand="1" w:evenHBand="0" w:firstRowFirstColumn="0" w:firstRowLastColumn="0" w:lastRowFirstColumn="0" w:lastRowLastColumn="0"/>
+            </w:pPr>
+            <w:r>
+              <w:rPr>
+                <w:noProof/>
+              </w:rPr>
+              <w:drawing>
+                <wp:inline distT="0" distB="0" distL="0" distR="0" wp14:anchorId="074CDC6F" wp14:editId="1A736439">
+                  <wp:extent cx="786384" cy="685800"/>
+                  <wp:effectExtent l="0" t="0" r="0" b="0"/>
+                  <wp:docPr id="5846650" name="Picture 3"/>
+                  <wp:cNvGraphicFramePr>
+                    <a:graphicFrameLocks xmlns:a="http://schemas.openxmlformats.org/drawingml/2006/main" noChangeAspect="1"/>
+                  </wp:cNvGraphicFramePr>
+                  <a:graphic xmlns:a="http://schemas.openxmlformats.org/drawingml/2006/main">
+                    <a:graphicData uri="http://schemas.openxmlformats.org/drawingml/2006/picture">
+                      <pic:pic xmlns:pic="http://schemas.openxmlformats.org/drawingml/2006/picture">
+                        <pic:nvPicPr>
+                          <pic:cNvPr id="0" name="Picture 5"/>
+                          <pic:cNvPicPr>
+                            <a:picLocks noChangeAspect="1" noChangeArrowheads="1"/>
+                          </pic:cNvPicPr>
+                        </pic:nvPicPr>
+                        <pic:blipFill>
+                          <a:blip r:embed="rId10" cstate="print">
+                            <a:extLst>
+                              <a:ext uri="{28A0092B-C50C-407E-A947-70E740481C1C}">
+                                <a14:useLocalDpi xmlns:a14="http://schemas.microsoft.com/office/drawing/2010/main" val="0"/>
+                              </a:ext>
+                            </a:extLst>
+                          </a:blip>
+                          <a:srcRect/>
+                          <a:stretch>
+                            <a:fillRect/>
+                          </a:stretch>
+                        </pic:blipFill>
+                        <pic:spPr bwMode="auto">
+                          <a:xfrm>
+                            <a:off x="0" y="0"/>
+                            <a:ext cx="786384" cy="685800"/>
+                          </a:xfrm>
+                          <a:prstGeom prst="rect">
+                            <a:avLst/>
+                          </a:prstGeom>
+                          <a:noFill/>
+                          <a:ln>
+                            <a:noFill/>
+                          </a:ln>
+                        </pic:spPr>
+                      </pic:pic>
+                    </a:graphicData>
+                  </a:graphic>
+                </wp:inline>
+              </w:drawing>
+            </w:r>
           </w:p>
         </w:tc>
       </w:tr>
@@ -7989,7 +8345,7 @@
       <w:pPr>
         <w:pStyle w:val="Heading2"/>
       </w:pPr>
-      <w:bookmarkStart w:id="38" w:name="_Toc229583551"/>
+      <w:bookmarkStart w:id="38" w:name="_Toc229731026"/>
       <w:r>
         <w:t>TC-005 – Monster Threat Event</w:t>
       </w:r>
@@ -8305,6 +8661,77 @@
               <w:spacing w:before="60" w:after="60"/>
               <w:cnfStyle w:val="000000000000" w:firstRow="0" w:lastRow="0" w:firstColumn="0" w:lastColumn="0" w:oddVBand="0" w:evenVBand="0" w:oddHBand="0" w:evenHBand="0" w:firstRowFirstColumn="0" w:firstRowLastColumn="0" w:lastRowFirstColumn="0" w:lastRowLastColumn="0"/>
             </w:pPr>
+            <w:r>
+              <w:t>5/15/26: Successfully Tested</w:t>
+            </w:r>
+          </w:p>
+        </w:tc>
+      </w:tr>
+      <w:tr>
+        <w:trPr>
+          <w:cnfStyle w:val="000000100000" w:firstRow="0" w:lastRow="0" w:firstColumn="0" w:lastColumn="0" w:oddVBand="0" w:evenVBand="0" w:oddHBand="1" w:evenHBand="0" w:firstRowFirstColumn="0" w:firstRowLastColumn="0" w:lastRowFirstColumn="0" w:lastRowLastColumn="0"/>
+        </w:trPr>
+        <w:tc>
+          <w:tcPr>
+            <w:cnfStyle w:val="001000000000" w:firstRow="0" w:lastRow="0" w:firstColumn="1" w:lastColumn="0" w:oddVBand="0" w:evenVBand="0" w:oddHBand="0" w:evenHBand="0" w:firstRowFirstColumn="0" w:firstRowLastColumn="0" w:lastRowFirstColumn="0" w:lastRowLastColumn="0"/>
+            <w:tcW w:w="2835" w:type="dxa"/>
+          </w:tcPr>
+          <w:p>
+            <w:pPr>
+              <w:spacing w:before="60" w:after="60"/>
+            </w:pPr>
+            <w:r>
+              <w:t>Test Image</w:t>
+            </w:r>
+          </w:p>
+        </w:tc>
+        <w:tc>
+          <w:tcPr>
+            <w:tcW w:w="4275" w:type="dxa"/>
+          </w:tcPr>
+          <w:p>
+            <w:pPr>
+              <w:spacing w:before="60" w:after="60"/>
+              <w:jc w:val="center"/>
+              <w:cnfStyle w:val="000000100000" w:firstRow="0" w:lastRow="0" w:firstColumn="0" w:lastColumn="0" w:oddVBand="0" w:evenVBand="0" w:oddHBand="1" w:evenHBand="0" w:firstRowFirstColumn="0" w:firstRowLastColumn="0" w:lastRowFirstColumn="0" w:lastRowLastColumn="0"/>
+            </w:pPr>
+            <w:r>
+              <w:drawing>
+                <wp:inline distT="0" distB="0" distL="0" distR="0" wp14:anchorId="359FAC41" wp14:editId="0F33E905">
+                  <wp:extent cx="786384" cy="685800"/>
+                  <wp:effectExtent l="0" t="0" r="0" b="0"/>
+                  <wp:docPr id="309554598" name="Picture 1"/>
+                  <wp:cNvGraphicFramePr>
+                    <a:graphicFrameLocks xmlns:a="http://schemas.openxmlformats.org/drawingml/2006/main" noChangeAspect="1"/>
+                  </wp:cNvGraphicFramePr>
+                  <a:graphic xmlns:a="http://schemas.openxmlformats.org/drawingml/2006/main">
+                    <a:graphicData uri="http://schemas.openxmlformats.org/drawingml/2006/picture">
+                      <pic:pic xmlns:pic="http://schemas.openxmlformats.org/drawingml/2006/picture">
+                        <pic:nvPicPr>
+                          <pic:cNvPr id="309554598" name=""/>
+                          <pic:cNvPicPr/>
+                        </pic:nvPicPr>
+                        <pic:blipFill>
+                          <a:blip r:embed="rId11"/>
+                          <a:stretch>
+                            <a:fillRect/>
+                          </a:stretch>
+                        </pic:blipFill>
+                        <pic:spPr>
+                          <a:xfrm>
+                            <a:off x="0" y="0"/>
+                            <a:ext cx="786384" cy="685800"/>
+                          </a:xfrm>
+                          <a:prstGeom prst="rect">
+                            <a:avLst/>
+                          </a:prstGeom>
+                        </pic:spPr>
+                      </pic:pic>
+                    </a:graphicData>
+                  </a:graphic>
+                </wp:inline>
+              </w:drawing>
+            </w:r>
           </w:p>
         </w:tc>
       </w:tr>
@@ -8313,9 +8740,8 @@
       <w:pPr>
         <w:pStyle w:val="Heading2"/>
       </w:pPr>
-      <w:bookmarkStart w:id="39" w:name="_Toc229583552"/>
-      <w:r>
-        <w:lastRenderedPageBreak/>
+      <w:bookmarkStart w:id="39" w:name="_Toc229731027"/>
+      <w:r>
         <w:t>TC-006 – Counter Monster Threat</w:t>
       </w:r>
       <w:bookmarkEnd w:id="39"/>
@@ -8633,6 +9059,93 @@
               <w:spacing w:after="0"/>
               <w:cnfStyle w:val="000000000000" w:firstRow="0" w:lastRow="0" w:firstColumn="0" w:lastColumn="0" w:oddVBand="0" w:evenVBand="0" w:oddHBand="0" w:evenHBand="0" w:firstRowFirstColumn="0" w:firstRowLastColumn="0" w:lastRowFirstColumn="0" w:lastRowLastColumn="0"/>
             </w:pPr>
+            <w:r>
+              <w:t>5/15/26: Successfully Tested</w:t>
+            </w:r>
+          </w:p>
+        </w:tc>
+      </w:tr>
+      <w:tr>
+        <w:trPr>
+          <w:cnfStyle w:val="000000100000" w:firstRow="0" w:lastRow="0" w:firstColumn="0" w:lastColumn="0" w:oddVBand="0" w:evenVBand="0" w:oddHBand="1" w:evenHBand="0" w:firstRowFirstColumn="0" w:firstRowLastColumn="0" w:lastRowFirstColumn="0" w:lastRowLastColumn="0"/>
+        </w:trPr>
+        <w:tc>
+          <w:tcPr>
+            <w:cnfStyle w:val="001000000000" w:firstRow="0" w:lastRow="0" w:firstColumn="1" w:lastColumn="0" w:oddVBand="0" w:evenVBand="0" w:oddHBand="0" w:evenHBand="0" w:firstRowFirstColumn="0" w:firstRowLastColumn="0" w:lastRowFirstColumn="0" w:lastRowLastColumn="0"/>
+            <w:tcW w:w="2835" w:type="dxa"/>
+          </w:tcPr>
+          <w:p>
+            <w:pPr>
+              <w:spacing w:after="0"/>
+            </w:pPr>
+            <w:r>
+              <w:t>Test Image</w:t>
+            </w:r>
+          </w:p>
+        </w:tc>
+        <w:tc>
+          <w:tcPr>
+            <w:tcW w:w="0" w:type="auto"/>
+          </w:tcPr>
+          <w:p>
+            <w:pPr>
+              <w:spacing w:after="0"/>
+              <w:jc w:val="center"/>
+              <w:cnfStyle w:val="000000100000" w:firstRow="0" w:lastRow="0" w:firstColumn="0" w:lastColumn="0" w:oddVBand="0" w:evenVBand="0" w:oddHBand="1" w:evenHBand="0" w:firstRowFirstColumn="0" w:firstRowLastColumn="0" w:lastRowFirstColumn="0" w:lastRowLastColumn="0"/>
+            </w:pPr>
+            <w:r>
+              <w:rPr>
+                <w:noProof/>
+              </w:rPr>
+              <w:drawing>
+                <wp:inline distT="0" distB="0" distL="0" distR="0" wp14:anchorId="2FA316E0" wp14:editId="220AFC07">
+                  <wp:extent cx="786384" cy="685800"/>
+                  <wp:effectExtent l="0" t="0" r="0" b="0"/>
+                  <wp:docPr id="122652207" name="Picture 4"/>
+                  <wp:cNvGraphicFramePr>
+                    <a:graphicFrameLocks xmlns:a="http://schemas.openxmlformats.org/drawingml/2006/main" noChangeAspect="1"/>
+                  </wp:cNvGraphicFramePr>
+                  <a:graphic xmlns:a="http://schemas.openxmlformats.org/drawingml/2006/main">
+                    <a:graphicData uri="http://schemas.openxmlformats.org/drawingml/2006/picture">
+                      <pic:pic xmlns:pic="http://schemas.openxmlformats.org/drawingml/2006/picture">
+                        <pic:nvPicPr>
+                          <pic:cNvPr id="0" name="Picture 7"/>
+                          <pic:cNvPicPr>
+                            <a:picLocks noChangeAspect="1" noChangeArrowheads="1"/>
+                          </pic:cNvPicPr>
+                        </pic:nvPicPr>
+                        <pic:blipFill>
+                          <a:blip r:embed="rId9" cstate="print">
+                            <a:extLst>
+                              <a:ext uri="{28A0092B-C50C-407E-A947-70E740481C1C}">
+                                <a14:useLocalDpi xmlns:a14="http://schemas.microsoft.com/office/drawing/2010/main" val="0"/>
+                              </a:ext>
+                            </a:extLst>
+                          </a:blip>
+                          <a:srcRect/>
+                          <a:stretch>
+                            <a:fillRect/>
+                          </a:stretch>
+                        </pic:blipFill>
+                        <pic:spPr bwMode="auto">
+                          <a:xfrm>
+                            <a:off x="0" y="0"/>
+                            <a:ext cx="786384" cy="685800"/>
+                          </a:xfrm>
+                          <a:prstGeom prst="rect">
+                            <a:avLst/>
+                          </a:prstGeom>
+                          <a:noFill/>
+                          <a:ln>
+                            <a:noFill/>
+                          </a:ln>
+                        </pic:spPr>
+                      </pic:pic>
+                    </a:graphicData>
+                  </a:graphic>
+                </wp:inline>
+              </w:drawing>
+            </w:r>
           </w:p>
         </w:tc>
       </w:tr>
@@ -8641,8 +9154,9 @@
       <w:pPr>
         <w:pStyle w:val="Heading2"/>
       </w:pPr>
-      <w:bookmarkStart w:id="40" w:name="_Toc229583553"/>
-      <w:r>
+      <w:bookmarkStart w:id="40" w:name="_Toc229731028"/>
+      <w:r>
+        <w:lastRenderedPageBreak/>
         <w:t>TC-007 – Failure Condition</w:t>
       </w:r>
       <w:bookmarkEnd w:id="40"/>
@@ -8975,6 +9489,77 @@
               <w:spacing w:after="0"/>
               <w:cnfStyle w:val="000000000000" w:firstRow="0" w:lastRow="0" w:firstColumn="0" w:lastColumn="0" w:oddVBand="0" w:evenVBand="0" w:oddHBand="0" w:evenHBand="0" w:firstRowFirstColumn="0" w:firstRowLastColumn="0" w:lastRowFirstColumn="0" w:lastRowLastColumn="0"/>
             </w:pPr>
+            <w:r>
+              <w:t>5/15/26: Successfully Tested</w:t>
+            </w:r>
+          </w:p>
+        </w:tc>
+      </w:tr>
+      <w:tr>
+        <w:trPr>
+          <w:cnfStyle w:val="000000100000" w:firstRow="0" w:lastRow="0" w:firstColumn="0" w:lastColumn="0" w:oddVBand="0" w:evenVBand="0" w:oddHBand="1" w:evenHBand="0" w:firstRowFirstColumn="0" w:firstRowLastColumn="0" w:lastRowFirstColumn="0" w:lastRowLastColumn="0"/>
+        </w:trPr>
+        <w:tc>
+          <w:tcPr>
+            <w:cnfStyle w:val="001000000000" w:firstRow="0" w:lastRow="0" w:firstColumn="1" w:lastColumn="0" w:oddVBand="0" w:evenVBand="0" w:oddHBand="0" w:evenHBand="0" w:firstRowFirstColumn="0" w:firstRowLastColumn="0" w:lastRowFirstColumn="0" w:lastRowLastColumn="0"/>
+            <w:tcW w:w="2835" w:type="dxa"/>
+          </w:tcPr>
+          <w:p>
+            <w:pPr>
+              <w:spacing w:after="0"/>
+            </w:pPr>
+            <w:r>
+              <w:t>Test Image</w:t>
+            </w:r>
+          </w:p>
+        </w:tc>
+        <w:tc>
+          <w:tcPr>
+            <w:tcW w:w="4275" w:type="dxa"/>
+          </w:tcPr>
+          <w:p>
+            <w:pPr>
+              <w:spacing w:after="0"/>
+              <w:jc w:val="center"/>
+              <w:cnfStyle w:val="000000100000" w:firstRow="0" w:lastRow="0" w:firstColumn="0" w:lastColumn="0" w:oddVBand="0" w:evenVBand="0" w:oddHBand="1" w:evenHBand="0" w:firstRowFirstColumn="0" w:firstRowLastColumn="0" w:lastRowFirstColumn="0" w:lastRowLastColumn="0"/>
+            </w:pPr>
+            <w:r>
+              <w:drawing>
+                <wp:inline distT="0" distB="0" distL="0" distR="0" wp14:anchorId="12E6E167" wp14:editId="57791B7F">
+                  <wp:extent cx="786384" cy="685800"/>
+                  <wp:effectExtent l="0" t="0" r="0" b="0"/>
+                  <wp:docPr id="445489709" name="Picture 1"/>
+                  <wp:cNvGraphicFramePr>
+                    <a:graphicFrameLocks xmlns:a="http://schemas.openxmlformats.org/drawingml/2006/main" noChangeAspect="1"/>
+                  </wp:cNvGraphicFramePr>
+                  <a:graphic xmlns:a="http://schemas.openxmlformats.org/drawingml/2006/main">
+                    <a:graphicData uri="http://schemas.openxmlformats.org/drawingml/2006/picture">
+                      <pic:pic xmlns:pic="http://schemas.openxmlformats.org/drawingml/2006/picture">
+                        <pic:nvPicPr>
+                          <pic:cNvPr id="445489709" name=""/>
+                          <pic:cNvPicPr/>
+                        </pic:nvPicPr>
+                        <pic:blipFill>
+                          <a:blip r:embed="rId12"/>
+                          <a:stretch>
+                            <a:fillRect/>
+                          </a:stretch>
+                        </pic:blipFill>
+                        <pic:spPr>
+                          <a:xfrm>
+                            <a:off x="0" y="0"/>
+                            <a:ext cx="786384" cy="685800"/>
+                          </a:xfrm>
+                          <a:prstGeom prst="rect">
+                            <a:avLst/>
+                          </a:prstGeom>
+                        </pic:spPr>
+                      </pic:pic>
+                    </a:graphicData>
+                  </a:graphic>
+                </wp:inline>
+              </w:drawing>
+            </w:r>
           </w:p>
         </w:tc>
       </w:tr>
@@ -8983,7 +9568,7 @@
       <w:pPr>
         <w:pStyle w:val="Heading2"/>
       </w:pPr>
-      <w:bookmarkStart w:id="41" w:name="_Toc229583554"/>
+      <w:bookmarkStart w:id="41" w:name="_Toc229731029"/>
       <w:r>
         <w:t>TC-008 – Night Completion</w:t>
       </w:r>
@@ -9296,6 +9881,96 @@
               <w:spacing w:after="0"/>
               <w:cnfStyle w:val="000000000000" w:firstRow="0" w:lastRow="0" w:firstColumn="0" w:lastColumn="0" w:oddVBand="0" w:evenVBand="0" w:oddHBand="0" w:evenHBand="0" w:firstRowFirstColumn="0" w:firstRowLastColumn="0" w:lastRowFirstColumn="0" w:lastRowLastColumn="0"/>
             </w:pPr>
+            <w:r>
+              <w:t>5/15/26: Successfully Tested</w:t>
+            </w:r>
+            <w:r>
+              <w:t>. Correctly advanced to next night when sleep meter reached 100%.</w:t>
+            </w:r>
+          </w:p>
+        </w:tc>
+      </w:tr>
+      <w:tr>
+        <w:trPr>
+          <w:cnfStyle w:val="000000100000" w:firstRow="0" w:lastRow="0" w:firstColumn="0" w:lastColumn="0" w:oddVBand="0" w:evenVBand="0" w:oddHBand="1" w:evenHBand="0" w:firstRowFirstColumn="0" w:firstRowLastColumn="0" w:lastRowFirstColumn="0" w:lastRowLastColumn="0"/>
+        </w:trPr>
+        <w:tc>
+          <w:tcPr>
+            <w:cnfStyle w:val="001000000000" w:firstRow="0" w:lastRow="0" w:firstColumn="1" w:lastColumn="0" w:oddVBand="0" w:evenVBand="0" w:oddHBand="0" w:evenHBand="0" w:firstRowFirstColumn="0" w:firstRowLastColumn="0" w:lastRowFirstColumn="0" w:lastRowLastColumn="0"/>
+            <w:tcW w:w="2835" w:type="dxa"/>
+          </w:tcPr>
+          <w:p>
+            <w:pPr>
+              <w:spacing w:after="0"/>
+            </w:pPr>
+            <w:r>
+              <w:t>Test Image</w:t>
+            </w:r>
+          </w:p>
+        </w:tc>
+        <w:tc>
+          <w:tcPr>
+            <w:tcW w:w="4275" w:type="dxa"/>
+          </w:tcPr>
+          <w:p>
+            <w:pPr>
+              <w:spacing w:after="0"/>
+              <w:jc w:val="center"/>
+              <w:cnfStyle w:val="000000100000" w:firstRow="0" w:lastRow="0" w:firstColumn="0" w:lastColumn="0" w:oddVBand="0" w:evenVBand="0" w:oddHBand="1" w:evenHBand="0" w:firstRowFirstColumn="0" w:firstRowLastColumn="0" w:lastRowFirstColumn="0" w:lastRowLastColumn="0"/>
+            </w:pPr>
+            <w:r>
+              <w:rPr>
+                <w:noProof/>
+              </w:rPr>
+              <w:drawing>
+                <wp:inline distT="0" distB="0" distL="0" distR="0" wp14:anchorId="5478939B" wp14:editId="33CEDD42">
+                  <wp:extent cx="786384" cy="685800"/>
+                  <wp:effectExtent l="0" t="0" r="0" b="0"/>
+                  <wp:docPr id="829130521" name="Picture 2"/>
+                  <wp:cNvGraphicFramePr>
+                    <a:graphicFrameLocks xmlns:a="http://schemas.openxmlformats.org/drawingml/2006/main" noChangeAspect="1"/>
+                  </wp:cNvGraphicFramePr>
+                  <a:graphic xmlns:a="http://schemas.openxmlformats.org/drawingml/2006/main">
+                    <a:graphicData uri="http://schemas.openxmlformats.org/drawingml/2006/picture">
+                      <pic:pic xmlns:pic="http://schemas.openxmlformats.org/drawingml/2006/picture">
+                        <pic:nvPicPr>
+                          <pic:cNvPr id="0" name="Picture 3"/>
+                          <pic:cNvPicPr>
+                            <a:picLocks noChangeAspect="1" noChangeArrowheads="1"/>
+                          </pic:cNvPicPr>
+                        </pic:nvPicPr>
+                        <pic:blipFill>
+                          <a:blip r:embed="rId13" cstate="print">
+                            <a:extLst>
+                              <a:ext uri="{28A0092B-C50C-407E-A947-70E740481C1C}">
+                                <a14:useLocalDpi xmlns:a14="http://schemas.microsoft.com/office/drawing/2010/main" val="0"/>
+                              </a:ext>
+                            </a:extLst>
+                          </a:blip>
+                          <a:srcRect/>
+                          <a:stretch>
+                            <a:fillRect/>
+                          </a:stretch>
+                        </pic:blipFill>
+                        <pic:spPr bwMode="auto">
+                          <a:xfrm>
+                            <a:off x="0" y="0"/>
+                            <a:ext cx="786384" cy="685800"/>
+                          </a:xfrm>
+                          <a:prstGeom prst="rect">
+                            <a:avLst/>
+                          </a:prstGeom>
+                          <a:noFill/>
+                          <a:ln>
+                            <a:noFill/>
+                          </a:ln>
+                        </pic:spPr>
+                      </pic:pic>
+                    </a:graphicData>
+                  </a:graphic>
+                </wp:inline>
+              </w:drawing>
+            </w:r>
           </w:p>
         </w:tc>
       </w:tr>
@@ -9304,9 +9979,8 @@
       <w:pPr>
         <w:pStyle w:val="Heading2"/>
       </w:pPr>
-      <w:bookmarkStart w:id="42" w:name="_Toc229583555"/>
-      <w:r>
-        <w:lastRenderedPageBreak/>
+      <w:bookmarkStart w:id="42" w:name="_Toc229731030"/>
+      <w:r>
         <w:t>TC-009 – Pause Functionality</w:t>
       </w:r>
       <w:bookmarkEnd w:id="42"/>
@@ -9373,6 +10047,7 @@
               <w:spacing w:after="0"/>
             </w:pPr>
             <w:r>
+              <w:lastRenderedPageBreak/>
               <w:t>Test Case ID</w:t>
             </w:r>
           </w:p>
@@ -9618,6 +10293,77 @@
               <w:spacing w:after="0"/>
               <w:cnfStyle w:val="000000000000" w:firstRow="0" w:lastRow="0" w:firstColumn="0" w:lastColumn="0" w:oddVBand="0" w:evenVBand="0" w:oddHBand="0" w:evenHBand="0" w:firstRowFirstColumn="0" w:firstRowLastColumn="0" w:lastRowFirstColumn="0" w:lastRowLastColumn="0"/>
             </w:pPr>
+            <w:r>
+              <w:t>5/15/26: Successfully Tested</w:t>
+            </w:r>
+          </w:p>
+        </w:tc>
+      </w:tr>
+      <w:tr>
+        <w:trPr>
+          <w:cnfStyle w:val="000000100000" w:firstRow="0" w:lastRow="0" w:firstColumn="0" w:lastColumn="0" w:oddVBand="0" w:evenVBand="0" w:oddHBand="1" w:evenHBand="0" w:firstRowFirstColumn="0" w:firstRowLastColumn="0" w:lastRowFirstColumn="0" w:lastRowLastColumn="0"/>
+        </w:trPr>
+        <w:tc>
+          <w:tcPr>
+            <w:cnfStyle w:val="001000000000" w:firstRow="0" w:lastRow="0" w:firstColumn="1" w:lastColumn="0" w:oddVBand="0" w:evenVBand="0" w:oddHBand="0" w:evenHBand="0" w:firstRowFirstColumn="0" w:firstRowLastColumn="0" w:lastRowFirstColumn="0" w:lastRowLastColumn="0"/>
+            <w:tcW w:w="2835" w:type="dxa"/>
+          </w:tcPr>
+          <w:p>
+            <w:pPr>
+              <w:spacing w:after="0"/>
+            </w:pPr>
+            <w:r>
+              <w:t>Test Image</w:t>
+            </w:r>
+          </w:p>
+        </w:tc>
+        <w:tc>
+          <w:tcPr>
+            <w:tcW w:w="4275" w:type="dxa"/>
+          </w:tcPr>
+          <w:p>
+            <w:pPr>
+              <w:spacing w:after="0"/>
+              <w:jc w:val="center"/>
+              <w:cnfStyle w:val="000000100000" w:firstRow="0" w:lastRow="0" w:firstColumn="0" w:lastColumn="0" w:oddVBand="0" w:evenVBand="0" w:oddHBand="1" w:evenHBand="0" w:firstRowFirstColumn="0" w:firstRowLastColumn="0" w:lastRowFirstColumn="0" w:lastRowLastColumn="0"/>
+            </w:pPr>
+            <w:r>
+              <w:drawing>
+                <wp:inline distT="0" distB="0" distL="0" distR="0" wp14:anchorId="00716D69" wp14:editId="5C20C9A0">
+                  <wp:extent cx="786384" cy="685800"/>
+                  <wp:effectExtent l="0" t="0" r="0" b="0"/>
+                  <wp:docPr id="1157102577" name="Picture 1"/>
+                  <wp:cNvGraphicFramePr>
+                    <a:graphicFrameLocks xmlns:a="http://schemas.openxmlformats.org/drawingml/2006/main" noChangeAspect="1"/>
+                  </wp:cNvGraphicFramePr>
+                  <a:graphic xmlns:a="http://schemas.openxmlformats.org/drawingml/2006/main">
+                    <a:graphicData uri="http://schemas.openxmlformats.org/drawingml/2006/picture">
+                      <pic:pic xmlns:pic="http://schemas.openxmlformats.org/drawingml/2006/picture">
+                        <pic:nvPicPr>
+                          <pic:cNvPr id="1157102577" name=""/>
+                          <pic:cNvPicPr/>
+                        </pic:nvPicPr>
+                        <pic:blipFill>
+                          <a:blip r:embed="rId14"/>
+                          <a:stretch>
+                            <a:fillRect/>
+                          </a:stretch>
+                        </pic:blipFill>
+                        <pic:spPr>
+                          <a:xfrm>
+                            <a:off x="0" y="0"/>
+                            <a:ext cx="786384" cy="685800"/>
+                          </a:xfrm>
+                          <a:prstGeom prst="rect">
+                            <a:avLst/>
+                          </a:prstGeom>
+                        </pic:spPr>
+                      </pic:pic>
+                    </a:graphicData>
+                  </a:graphic>
+                </wp:inline>
+              </w:drawing>
+            </w:r>
           </w:p>
         </w:tc>
       </w:tr>
@@ -9626,7 +10372,7 @@
       <w:pPr>
         <w:pStyle w:val="Heading2"/>
       </w:pPr>
-      <w:bookmarkStart w:id="43" w:name="_Toc229583556"/>
+      <w:bookmarkStart w:id="43" w:name="_Toc229731031"/>
       <w:r>
         <w:t>TC-010 – Resume Functionality</w:t>
       </w:r>
@@ -9939,6 +10685,77 @@
               <w:spacing w:after="0"/>
               <w:cnfStyle w:val="000000000000" w:firstRow="0" w:lastRow="0" w:firstColumn="0" w:lastColumn="0" w:oddVBand="0" w:evenVBand="0" w:oddHBand="0" w:evenHBand="0" w:firstRowFirstColumn="0" w:firstRowLastColumn="0" w:lastRowFirstColumn="0" w:lastRowLastColumn="0"/>
             </w:pPr>
+            <w:r>
+              <w:t>5/15/26: Successfully Tested</w:t>
+            </w:r>
+          </w:p>
+        </w:tc>
+      </w:tr>
+      <w:tr>
+        <w:trPr>
+          <w:cnfStyle w:val="000000100000" w:firstRow="0" w:lastRow="0" w:firstColumn="0" w:lastColumn="0" w:oddVBand="0" w:evenVBand="0" w:oddHBand="1" w:evenHBand="0" w:firstRowFirstColumn="0" w:firstRowLastColumn="0" w:lastRowFirstColumn="0" w:lastRowLastColumn="0"/>
+        </w:trPr>
+        <w:tc>
+          <w:tcPr>
+            <w:cnfStyle w:val="001000000000" w:firstRow="0" w:lastRow="0" w:firstColumn="1" w:lastColumn="0" w:oddVBand="0" w:evenVBand="0" w:oddHBand="0" w:evenHBand="0" w:firstRowFirstColumn="0" w:firstRowLastColumn="0" w:lastRowFirstColumn="0" w:lastRowLastColumn="0"/>
+            <w:tcW w:w="2835" w:type="dxa"/>
+          </w:tcPr>
+          <w:p>
+            <w:pPr>
+              <w:spacing w:after="0"/>
+            </w:pPr>
+            <w:r>
+              <w:t>Test Image</w:t>
+            </w:r>
+          </w:p>
+        </w:tc>
+        <w:tc>
+          <w:tcPr>
+            <w:tcW w:w="4275" w:type="dxa"/>
+          </w:tcPr>
+          <w:p>
+            <w:pPr>
+              <w:spacing w:after="0"/>
+              <w:jc w:val="center"/>
+              <w:cnfStyle w:val="000000100000" w:firstRow="0" w:lastRow="0" w:firstColumn="0" w:lastColumn="0" w:oddVBand="0" w:evenVBand="0" w:oddHBand="1" w:evenHBand="0" w:firstRowFirstColumn="0" w:firstRowLastColumn="0" w:lastRowFirstColumn="0" w:lastRowLastColumn="0"/>
+            </w:pPr>
+            <w:r>
+              <w:drawing>
+                <wp:inline distT="0" distB="0" distL="0" distR="0" wp14:anchorId="06B7BB18" wp14:editId="732C2930">
+                  <wp:extent cx="786384" cy="685800"/>
+                  <wp:effectExtent l="0" t="0" r="0" b="0"/>
+                  <wp:docPr id="233119477" name="Picture 1"/>
+                  <wp:cNvGraphicFramePr>
+                    <a:graphicFrameLocks xmlns:a="http://schemas.openxmlformats.org/drawingml/2006/main" noChangeAspect="1"/>
+                  </wp:cNvGraphicFramePr>
+                  <a:graphic xmlns:a="http://schemas.openxmlformats.org/drawingml/2006/main">
+                    <a:graphicData uri="http://schemas.openxmlformats.org/drawingml/2006/picture">
+                      <pic:pic xmlns:pic="http://schemas.openxmlformats.org/drawingml/2006/picture">
+                        <pic:nvPicPr>
+                          <pic:cNvPr id="233119477" name=""/>
+                          <pic:cNvPicPr/>
+                        </pic:nvPicPr>
+                        <pic:blipFill>
+                          <a:blip r:embed="rId15"/>
+                          <a:stretch>
+                            <a:fillRect/>
+                          </a:stretch>
+                        </pic:blipFill>
+                        <pic:spPr>
+                          <a:xfrm>
+                            <a:off x="0" y="0"/>
+                            <a:ext cx="786384" cy="685800"/>
+                          </a:xfrm>
+                          <a:prstGeom prst="rect">
+                            <a:avLst/>
+                          </a:prstGeom>
+                        </pic:spPr>
+                      </pic:pic>
+                    </a:graphicData>
+                  </a:graphic>
+                </wp:inline>
+              </w:drawing>
+            </w:r>
           </w:p>
         </w:tc>
       </w:tr>
@@ -9947,7 +10764,7 @@
       <w:pPr>
         <w:pStyle w:val="Heading2"/>
       </w:pPr>
-      <w:bookmarkStart w:id="44" w:name="_Toc229583557"/>
+      <w:bookmarkStart w:id="44" w:name="_Toc229731032"/>
       <w:r>
         <w:t>TC-011 – UI Sleep Meter Update</w:t>
       </w:r>
@@ -10149,6 +10966,7 @@
               <w:spacing w:after="0"/>
             </w:pPr>
             <w:r>
+              <w:lastRenderedPageBreak/>
               <w:t>Steps</w:t>
             </w:r>
           </w:p>
@@ -10260,6 +11078,77 @@
               <w:spacing w:after="0"/>
               <w:cnfStyle w:val="000000000000" w:firstRow="0" w:lastRow="0" w:firstColumn="0" w:lastColumn="0" w:oddVBand="0" w:evenVBand="0" w:oddHBand="0" w:evenHBand="0" w:firstRowFirstColumn="0" w:firstRowLastColumn="0" w:lastRowFirstColumn="0" w:lastRowLastColumn="0"/>
             </w:pPr>
+            <w:r>
+              <w:t>5/15/26: Successfully Tested</w:t>
+            </w:r>
+          </w:p>
+        </w:tc>
+      </w:tr>
+      <w:tr>
+        <w:trPr>
+          <w:cnfStyle w:val="000000100000" w:firstRow="0" w:lastRow="0" w:firstColumn="0" w:lastColumn="0" w:oddVBand="0" w:evenVBand="0" w:oddHBand="1" w:evenHBand="0" w:firstRowFirstColumn="0" w:firstRowLastColumn="0" w:lastRowFirstColumn="0" w:lastRowLastColumn="0"/>
+        </w:trPr>
+        <w:tc>
+          <w:tcPr>
+            <w:cnfStyle w:val="001000000000" w:firstRow="0" w:lastRow="0" w:firstColumn="1" w:lastColumn="0" w:oddVBand="0" w:evenVBand="0" w:oddHBand="0" w:evenHBand="0" w:firstRowFirstColumn="0" w:firstRowLastColumn="0" w:lastRowFirstColumn="0" w:lastRowLastColumn="0"/>
+            <w:tcW w:w="2835" w:type="dxa"/>
+          </w:tcPr>
+          <w:p>
+            <w:pPr>
+              <w:spacing w:after="0"/>
+            </w:pPr>
+            <w:r>
+              <w:t>Test Image</w:t>
+            </w:r>
+          </w:p>
+        </w:tc>
+        <w:tc>
+          <w:tcPr>
+            <w:tcW w:w="4275" w:type="dxa"/>
+          </w:tcPr>
+          <w:p>
+            <w:pPr>
+              <w:spacing w:after="0"/>
+              <w:jc w:val="center"/>
+              <w:cnfStyle w:val="000000100000" w:firstRow="0" w:lastRow="0" w:firstColumn="0" w:lastColumn="0" w:oddVBand="0" w:evenVBand="0" w:oddHBand="1" w:evenHBand="0" w:firstRowFirstColumn="0" w:firstRowLastColumn="0" w:lastRowFirstColumn="0" w:lastRowLastColumn="0"/>
+            </w:pPr>
+            <w:r>
+              <w:drawing>
+                <wp:inline distT="0" distB="0" distL="0" distR="0" wp14:anchorId="2674DCD2" wp14:editId="00351359">
+                  <wp:extent cx="786384" cy="685800"/>
+                  <wp:effectExtent l="0" t="0" r="0" b="0"/>
+                  <wp:docPr id="851735225" name="Picture 1"/>
+                  <wp:cNvGraphicFramePr>
+                    <a:graphicFrameLocks xmlns:a="http://schemas.openxmlformats.org/drawingml/2006/main" noChangeAspect="1"/>
+                  </wp:cNvGraphicFramePr>
+                  <a:graphic xmlns:a="http://schemas.openxmlformats.org/drawingml/2006/main">
+                    <a:graphicData uri="http://schemas.openxmlformats.org/drawingml/2006/picture">
+                      <pic:pic xmlns:pic="http://schemas.openxmlformats.org/drawingml/2006/picture">
+                        <pic:nvPicPr>
+                          <pic:cNvPr id="851735225" name=""/>
+                          <pic:cNvPicPr/>
+                        </pic:nvPicPr>
+                        <pic:blipFill>
+                          <a:blip r:embed="rId16"/>
+                          <a:stretch>
+                            <a:fillRect/>
+                          </a:stretch>
+                        </pic:blipFill>
+                        <pic:spPr>
+                          <a:xfrm>
+                            <a:off x="0" y="0"/>
+                            <a:ext cx="786384" cy="685800"/>
+                          </a:xfrm>
+                          <a:prstGeom prst="rect">
+                            <a:avLst/>
+                          </a:prstGeom>
+                        </pic:spPr>
+                      </pic:pic>
+                    </a:graphicData>
+                  </a:graphic>
+                </wp:inline>
+              </w:drawing>
+            </w:r>
           </w:p>
         </w:tc>
       </w:tr>
@@ -10268,9 +11157,8 @@
       <w:pPr>
         <w:pStyle w:val="Heading2"/>
       </w:pPr>
-      <w:bookmarkStart w:id="45" w:name="_Toc229583558"/>
-      <w:r>
-        <w:lastRenderedPageBreak/>
+      <w:bookmarkStart w:id="45" w:name="_Toc229731033"/>
+      <w:r>
         <w:t>TC-012 – Audio Playback</w:t>
       </w:r>
       <w:bookmarkEnd w:id="45"/>
@@ -10582,6 +11470,12 @@
               <w:spacing w:after="0"/>
               <w:cnfStyle w:val="000000000000" w:firstRow="0" w:lastRow="0" w:firstColumn="0" w:lastColumn="0" w:oddVBand="0" w:evenVBand="0" w:oddHBand="0" w:evenHBand="0" w:firstRowFirstColumn="0" w:firstRowLastColumn="0" w:lastRowFirstColumn="0" w:lastRowLastColumn="0"/>
             </w:pPr>
+            <w:r>
+              <w:t xml:space="preserve">5/15/26: Successfully </w:t>
+            </w:r>
+            <w:r>
+              <w:t>tested, audio plays.</w:t>
+            </w:r>
           </w:p>
         </w:tc>
       </w:tr>
@@ -10590,7 +11484,7 @@
       <w:pPr>
         <w:pStyle w:val="Heading2"/>
       </w:pPr>
-      <w:bookmarkStart w:id="46" w:name="_Toc229583559"/>
+      <w:bookmarkStart w:id="46" w:name="_Toc229731034"/>
       <w:r>
         <w:t>TC-013 – Performance Validation</w:t>
       </w:r>
@@ -10807,7 +11701,25 @@
               <w:cnfStyle w:val="000000100000" w:firstRow="0" w:lastRow="0" w:firstColumn="0" w:lastColumn="0" w:oddVBand="0" w:evenVBand="0" w:oddHBand="1" w:evenHBand="0" w:firstRowFirstColumn="0" w:firstRowLastColumn="0" w:lastRowFirstColumn="0" w:lastRowLastColumn="0"/>
             </w:pPr>
             <w:r>
-              <w:t>Play for 30 minutes</w:t>
+              <w:t xml:space="preserve">Play for </w:t>
+            </w:r>
+            <w:r>
+              <w:t>10</w:t>
+            </w:r>
+            <w:r>
+              <w:t xml:space="preserve"> minutes</w:t>
+            </w:r>
+            <w:r>
+              <w:t xml:space="preserve"> or complete </w:t>
+            </w:r>
+            <w:r>
+              <w:t xml:space="preserve">a </w:t>
+            </w:r>
+            <w:r>
+              <w:t>game</w:t>
+            </w:r>
+            <w:r>
+              <w:t>.</w:t>
             </w:r>
           </w:p>
         </w:tc>
@@ -10903,6 +11815,12 @@
               <w:spacing w:after="0"/>
               <w:cnfStyle w:val="000000000000" w:firstRow="0" w:lastRow="0" w:firstColumn="0" w:lastColumn="0" w:oddVBand="0" w:evenVBand="0" w:oddHBand="0" w:evenHBand="0" w:firstRowFirstColumn="0" w:firstRowLastColumn="0" w:lastRowFirstColumn="0" w:lastRowLastColumn="0"/>
             </w:pPr>
+            <w:r>
+              <w:t>5/15/26: Successfully Tested</w:t>
+            </w:r>
+            <w:r>
+              <w:t>. No issues with FPS</w:t>
+            </w:r>
           </w:p>
         </w:tc>
       </w:tr>
@@ -10911,7 +11829,7 @@
       <w:pPr>
         <w:pStyle w:val="Heading2"/>
       </w:pPr>
-      <w:bookmarkStart w:id="47" w:name="_Toc229583560"/>
+      <w:bookmarkStart w:id="47" w:name="_Toc229731035"/>
       <w:r>
         <w:t>TC-014 – Input Response Validation</w:t>
       </w:r>
@@ -10979,6 +11897,7 @@
               <w:spacing w:after="0"/>
             </w:pPr>
             <w:r>
+              <w:lastRenderedPageBreak/>
               <w:t>Test Case ID</w:t>
             </w:r>
           </w:p>
@@ -11235,6 +12154,20 @@
               <w:spacing w:after="0"/>
               <w:cnfStyle w:val="000000000000" w:firstRow="0" w:lastRow="0" w:firstColumn="0" w:lastColumn="0" w:oddVBand="0" w:evenVBand="0" w:oddHBand="0" w:evenHBand="0" w:firstRowFirstColumn="0" w:firstRowLastColumn="0" w:lastRowFirstColumn="0" w:lastRowLastColumn="0"/>
             </w:pPr>
+            <w:r>
+              <w:t>5/15/26: Successfully Tested</w:t>
+            </w:r>
+            <w:r>
+              <w:t xml:space="preserve">. No issues </w:t>
+            </w:r>
+            <w:proofErr w:type="gramStart"/>
+            <w:r>
+              <w:t>found</w:t>
+            </w:r>
+            <w:proofErr w:type="gramEnd"/>
+            <w:r>
+              <w:t xml:space="preserve"> with response rate.</w:t>
+            </w:r>
           </w:p>
         </w:tc>
       </w:tr>
@@ -11244,9 +12177,8 @@
       <w:pPr>
         <w:pStyle w:val="Heading1"/>
       </w:pPr>
-      <w:bookmarkStart w:id="48" w:name="_Toc229583561"/>
-      <w:r>
-        <w:lastRenderedPageBreak/>
+      <w:bookmarkStart w:id="48" w:name="_Toc229731036"/>
+      <w:r>
         <w:t>Requirements Traceability Matrix</w:t>
       </w:r>
       <w:bookmarkEnd w:id="48"/>
@@ -11258,11 +12190,11 @@
         <w:tblLook w:val="04A0" w:firstRow="1" w:lastRow="0" w:firstColumn="1" w:lastColumn="0" w:noHBand="0" w:noVBand="1"/>
       </w:tblPr>
       <w:tblGrid>
-        <w:gridCol w:w="1750"/>
-        <w:gridCol w:w="3705"/>
-        <w:gridCol w:w="1426"/>
+        <w:gridCol w:w="1744"/>
+        <w:gridCol w:w="3654"/>
+        <w:gridCol w:w="1408"/>
         <w:gridCol w:w="1182"/>
-        <w:gridCol w:w="938"/>
+        <w:gridCol w:w="1072"/>
       </w:tblGrid>
       <w:tr>
         <w:trPr>
@@ -11425,7 +12357,7 @@
               <w:cnfStyle w:val="000000100000" w:firstRow="0" w:lastRow="0" w:firstColumn="0" w:lastColumn="0" w:oddVBand="0" w:evenVBand="0" w:oddHBand="1" w:evenHBand="0" w:firstRowFirstColumn="0" w:firstRowLastColumn="0" w:lastRowFirstColumn="0" w:lastRowLastColumn="0"/>
             </w:pPr>
             <w:r>
-              <w:t>Pending</w:t>
+              <w:t>Complete</w:t>
             </w:r>
           </w:p>
         </w:tc>
@@ -11502,7 +12434,7 @@
               <w:cnfStyle w:val="000000000000" w:firstRow="0" w:lastRow="0" w:firstColumn="0" w:lastColumn="0" w:oddVBand="0" w:evenVBand="0" w:oddHBand="0" w:evenHBand="0" w:firstRowFirstColumn="0" w:firstRowLastColumn="0" w:lastRowFirstColumn="0" w:lastRowLastColumn="0"/>
             </w:pPr>
             <w:r>
-              <w:t>Pending</w:t>
+              <w:t>Complete</w:t>
             </w:r>
           </w:p>
         </w:tc>
@@ -11582,7 +12514,7 @@
               <w:cnfStyle w:val="000000100000" w:firstRow="0" w:lastRow="0" w:firstColumn="0" w:lastColumn="0" w:oddVBand="0" w:evenVBand="0" w:oddHBand="1" w:evenHBand="0" w:firstRowFirstColumn="0" w:firstRowLastColumn="0" w:lastRowFirstColumn="0" w:lastRowLastColumn="0"/>
             </w:pPr>
             <w:r>
-              <w:t>Pending</w:t>
+              <w:t>Complete</w:t>
             </w:r>
           </w:p>
         </w:tc>
@@ -11659,7 +12591,7 @@
               <w:cnfStyle w:val="000000000000" w:firstRow="0" w:lastRow="0" w:firstColumn="0" w:lastColumn="0" w:oddVBand="0" w:evenVBand="0" w:oddHBand="0" w:evenHBand="0" w:firstRowFirstColumn="0" w:firstRowLastColumn="0" w:lastRowFirstColumn="0" w:lastRowLastColumn="0"/>
             </w:pPr>
             <w:r>
-              <w:t>Pending</w:t>
+              <w:t>Complete</w:t>
             </w:r>
           </w:p>
         </w:tc>
@@ -11739,7 +12671,7 @@
               <w:cnfStyle w:val="000000100000" w:firstRow="0" w:lastRow="0" w:firstColumn="0" w:lastColumn="0" w:oddVBand="0" w:evenVBand="0" w:oddHBand="1" w:evenHBand="0" w:firstRowFirstColumn="0" w:firstRowLastColumn="0" w:lastRowFirstColumn="0" w:lastRowLastColumn="0"/>
             </w:pPr>
             <w:r>
-              <w:t>Pending</w:t>
+              <w:t>Complete</w:t>
             </w:r>
           </w:p>
         </w:tc>
@@ -11816,7 +12748,7 @@
               <w:cnfStyle w:val="000000000000" w:firstRow="0" w:lastRow="0" w:firstColumn="0" w:lastColumn="0" w:oddVBand="0" w:evenVBand="0" w:oddHBand="0" w:evenHBand="0" w:firstRowFirstColumn="0" w:firstRowLastColumn="0" w:lastRowFirstColumn="0" w:lastRowLastColumn="0"/>
             </w:pPr>
             <w:r>
-              <w:t>Pending</w:t>
+              <w:t>Complete</w:t>
             </w:r>
           </w:p>
         </w:tc>
@@ -11896,7 +12828,7 @@
               <w:cnfStyle w:val="000000100000" w:firstRow="0" w:lastRow="0" w:firstColumn="0" w:lastColumn="0" w:oddVBand="0" w:evenVBand="0" w:oddHBand="1" w:evenHBand="0" w:firstRowFirstColumn="0" w:firstRowLastColumn="0" w:lastRowFirstColumn="0" w:lastRowLastColumn="0"/>
             </w:pPr>
             <w:r>
-              <w:t>Pending</w:t>
+              <w:t>Complete</w:t>
             </w:r>
           </w:p>
         </w:tc>
@@ -11973,7 +12905,7 @@
               <w:cnfStyle w:val="000000000000" w:firstRow="0" w:lastRow="0" w:firstColumn="0" w:lastColumn="0" w:oddVBand="0" w:evenVBand="0" w:oddHBand="0" w:evenHBand="0" w:firstRowFirstColumn="0" w:firstRowLastColumn="0" w:lastRowFirstColumn="0" w:lastRowLastColumn="0"/>
             </w:pPr>
             <w:r>
-              <w:t>Pending</w:t>
+              <w:t>Complete</w:t>
             </w:r>
           </w:p>
         </w:tc>
@@ -12053,7 +12985,7 @@
               <w:cnfStyle w:val="000000100000" w:firstRow="0" w:lastRow="0" w:firstColumn="0" w:lastColumn="0" w:oddVBand="0" w:evenVBand="0" w:oddHBand="1" w:evenHBand="0" w:firstRowFirstColumn="0" w:firstRowLastColumn="0" w:lastRowFirstColumn="0" w:lastRowLastColumn="0"/>
             </w:pPr>
             <w:r>
-              <w:t>Pending</w:t>
+              <w:t>Complete</w:t>
             </w:r>
           </w:p>
         </w:tc>
@@ -12130,7 +13062,7 @@
               <w:cnfStyle w:val="000000000000" w:firstRow="0" w:lastRow="0" w:firstColumn="0" w:lastColumn="0" w:oddVBand="0" w:evenVBand="0" w:oddHBand="0" w:evenHBand="0" w:firstRowFirstColumn="0" w:firstRowLastColumn="0" w:lastRowFirstColumn="0" w:lastRowLastColumn="0"/>
             </w:pPr>
             <w:r>
-              <w:t>Pending</w:t>
+              <w:t>Complete</w:t>
             </w:r>
           </w:p>
         </w:tc>
@@ -12222,7 +13154,7 @@
               <w:cnfStyle w:val="000000100000" w:firstRow="0" w:lastRow="0" w:firstColumn="0" w:lastColumn="0" w:oddVBand="0" w:evenVBand="0" w:oddHBand="1" w:evenHBand="0" w:firstRowFirstColumn="0" w:firstRowLastColumn="0" w:lastRowFirstColumn="0" w:lastRowLastColumn="0"/>
             </w:pPr>
             <w:r>
-              <w:t>Pending</w:t>
+              <w:t>Complete</w:t>
             </w:r>
           </w:p>
         </w:tc>
@@ -12299,7 +13231,7 @@
               <w:cnfStyle w:val="000000000000" w:firstRow="0" w:lastRow="0" w:firstColumn="0" w:lastColumn="0" w:oddVBand="0" w:evenVBand="0" w:oddHBand="0" w:evenHBand="0" w:firstRowFirstColumn="0" w:firstRowLastColumn="0" w:lastRowFirstColumn="0" w:lastRowLastColumn="0"/>
             </w:pPr>
             <w:r>
-              <w:t>Pending</w:t>
+              <w:t>Complete</w:t>
             </w:r>
           </w:p>
         </w:tc>
@@ -12379,7 +13311,7 @@
               <w:cnfStyle w:val="000000100000" w:firstRow="0" w:lastRow="0" w:firstColumn="0" w:lastColumn="0" w:oddVBand="0" w:evenVBand="0" w:oddHBand="1" w:evenHBand="0" w:firstRowFirstColumn="0" w:firstRowLastColumn="0" w:lastRowFirstColumn="0" w:lastRowLastColumn="0"/>
             </w:pPr>
             <w:r>
-              <w:t>Pending</w:t>
+              <w:t>Complete</w:t>
             </w:r>
           </w:p>
         </w:tc>
@@ -12462,7 +13394,7 @@
               <w:cnfStyle w:val="000000000000" w:firstRow="0" w:lastRow="0" w:firstColumn="0" w:lastColumn="0" w:oddVBand="0" w:evenVBand="0" w:oddHBand="0" w:evenHBand="0" w:firstRowFirstColumn="0" w:firstRowLastColumn="0" w:lastRowFirstColumn="0" w:lastRowLastColumn="0"/>
             </w:pPr>
             <w:r>
-              <w:t>Pending</w:t>
+              <w:t>Complete</w:t>
             </w:r>
           </w:p>
         </w:tc>
@@ -12542,7 +13474,7 @@
               <w:cnfStyle w:val="000000100000" w:firstRow="0" w:lastRow="0" w:firstColumn="0" w:lastColumn="0" w:oddVBand="0" w:evenVBand="0" w:oddHBand="1" w:evenHBand="0" w:firstRowFirstColumn="0" w:firstRowLastColumn="0" w:lastRowFirstColumn="0" w:lastRowLastColumn="0"/>
             </w:pPr>
             <w:r>
-              <w:t>Pending</w:t>
+              <w:t>Complete</w:t>
             </w:r>
           </w:p>
         </w:tc>
@@ -12619,7 +13551,7 @@
               <w:cnfStyle w:val="000000000000" w:firstRow="0" w:lastRow="0" w:firstColumn="0" w:lastColumn="0" w:oddVBand="0" w:evenVBand="0" w:oddHBand="0" w:evenHBand="0" w:firstRowFirstColumn="0" w:firstRowLastColumn="0" w:lastRowFirstColumn="0" w:lastRowLastColumn="0"/>
             </w:pPr>
             <w:r>
-              <w:t>Pending</w:t>
+              <w:t>Complete</w:t>
             </w:r>
           </w:p>
         </w:tc>
@@ -12699,7 +13631,7 @@
               <w:cnfStyle w:val="000000100000" w:firstRow="0" w:lastRow="0" w:firstColumn="0" w:lastColumn="0" w:oddVBand="0" w:evenVBand="0" w:oddHBand="1" w:evenHBand="0" w:firstRowFirstColumn="0" w:firstRowLastColumn="0" w:lastRowFirstColumn="0" w:lastRowLastColumn="0"/>
             </w:pPr>
             <w:r>
-              <w:t>Pending</w:t>
+              <w:t>Complete</w:t>
             </w:r>
           </w:p>
         </w:tc>
@@ -12776,7 +13708,7 @@
               <w:cnfStyle w:val="000000000000" w:firstRow="0" w:lastRow="0" w:firstColumn="0" w:lastColumn="0" w:oddVBand="0" w:evenVBand="0" w:oddHBand="0" w:evenHBand="0" w:firstRowFirstColumn="0" w:firstRowLastColumn="0" w:lastRowFirstColumn="0" w:lastRowLastColumn="0"/>
             </w:pPr>
             <w:r>
-              <w:t>Pending</w:t>
+              <w:t>Complete</w:t>
             </w:r>
           </w:p>
         </w:tc>
@@ -12796,6 +13728,7 @@
               <w:spacing w:after="0"/>
             </w:pPr>
             <w:r>
+              <w:lastRenderedPageBreak/>
               <w:t>FR-ENV-07</w:t>
             </w:r>
           </w:p>
@@ -12856,7 +13789,7 @@
               <w:cnfStyle w:val="000000100000" w:firstRow="0" w:lastRow="0" w:firstColumn="0" w:lastColumn="0" w:oddVBand="0" w:evenVBand="0" w:oddHBand="1" w:evenHBand="0" w:firstRowFirstColumn="0" w:firstRowLastColumn="0" w:lastRowFirstColumn="0" w:lastRowLastColumn="0"/>
             </w:pPr>
             <w:r>
-              <w:t>Pending</w:t>
+              <w:t>Complete</w:t>
             </w:r>
           </w:p>
         </w:tc>
@@ -12933,7 +13866,7 @@
               <w:cnfStyle w:val="000000000000" w:firstRow="0" w:lastRow="0" w:firstColumn="0" w:lastColumn="0" w:oddVBand="0" w:evenVBand="0" w:oddHBand="0" w:evenHBand="0" w:firstRowFirstColumn="0" w:firstRowLastColumn="0" w:lastRowFirstColumn="0" w:lastRowLastColumn="0"/>
             </w:pPr>
             <w:r>
-              <w:t>Pending</w:t>
+              <w:t>Complete</w:t>
             </w:r>
           </w:p>
         </w:tc>
@@ -13013,7 +13946,7 @@
               <w:cnfStyle w:val="000000100000" w:firstRow="0" w:lastRow="0" w:firstColumn="0" w:lastColumn="0" w:oddVBand="0" w:evenVBand="0" w:oddHBand="1" w:evenHBand="0" w:firstRowFirstColumn="0" w:firstRowLastColumn="0" w:lastRowFirstColumn="0" w:lastRowLastColumn="0"/>
             </w:pPr>
             <w:r>
-              <w:t>Pending</w:t>
+              <w:t>Complete</w:t>
             </w:r>
           </w:p>
         </w:tc>
@@ -13090,7 +14023,7 @@
               <w:cnfStyle w:val="000000000000" w:firstRow="0" w:lastRow="0" w:firstColumn="0" w:lastColumn="0" w:oddVBand="0" w:evenVBand="0" w:oddHBand="0" w:evenHBand="0" w:firstRowFirstColumn="0" w:firstRowLastColumn="0" w:lastRowFirstColumn="0" w:lastRowLastColumn="0"/>
             </w:pPr>
             <w:r>
-              <w:t>Pending</w:t>
+              <w:t>Complete</w:t>
             </w:r>
           </w:p>
         </w:tc>
@@ -13170,7 +14103,7 @@
               <w:cnfStyle w:val="000000100000" w:firstRow="0" w:lastRow="0" w:firstColumn="0" w:lastColumn="0" w:oddVBand="0" w:evenVBand="0" w:oddHBand="1" w:evenHBand="0" w:firstRowFirstColumn="0" w:firstRowLastColumn="0" w:lastRowFirstColumn="0" w:lastRowLastColumn="0"/>
             </w:pPr>
             <w:r>
-              <w:t>Pending</w:t>
+              <w:t>Complete</w:t>
             </w:r>
           </w:p>
         </w:tc>
@@ -13247,7 +14180,7 @@
               <w:cnfStyle w:val="000000000000" w:firstRow="0" w:lastRow="0" w:firstColumn="0" w:lastColumn="0" w:oddVBand="0" w:evenVBand="0" w:oddHBand="0" w:evenHBand="0" w:firstRowFirstColumn="0" w:firstRowLastColumn="0" w:lastRowFirstColumn="0" w:lastRowLastColumn="0"/>
             </w:pPr>
             <w:r>
-              <w:t>Pending</w:t>
+              <w:t>Complete</w:t>
             </w:r>
           </w:p>
         </w:tc>
@@ -13327,7 +14260,7 @@
               <w:cnfStyle w:val="000000100000" w:firstRow="0" w:lastRow="0" w:firstColumn="0" w:lastColumn="0" w:oddVBand="0" w:evenVBand="0" w:oddHBand="1" w:evenHBand="0" w:firstRowFirstColumn="0" w:firstRowLastColumn="0" w:lastRowFirstColumn="0" w:lastRowLastColumn="0"/>
             </w:pPr>
             <w:r>
-              <w:t>Pending</w:t>
+              <w:t>Complete</w:t>
             </w:r>
           </w:p>
         </w:tc>
@@ -13404,7 +14337,7 @@
               <w:cnfStyle w:val="000000000000" w:firstRow="0" w:lastRow="0" w:firstColumn="0" w:lastColumn="0" w:oddVBand="0" w:evenVBand="0" w:oddHBand="0" w:evenHBand="0" w:firstRowFirstColumn="0" w:firstRowLastColumn="0" w:lastRowFirstColumn="0" w:lastRowLastColumn="0"/>
             </w:pPr>
             <w:r>
-              <w:t>Pending</w:t>
+              <w:t>Complete</w:t>
             </w:r>
           </w:p>
         </w:tc>
@@ -13484,7 +14417,7 @@
               <w:cnfStyle w:val="000000100000" w:firstRow="0" w:lastRow="0" w:firstColumn="0" w:lastColumn="0" w:oddVBand="0" w:evenVBand="0" w:oddHBand="1" w:evenHBand="0" w:firstRowFirstColumn="0" w:firstRowLastColumn="0" w:lastRowFirstColumn="0" w:lastRowLastColumn="0"/>
             </w:pPr>
             <w:r>
-              <w:t>Pending</w:t>
+              <w:t>Complete</w:t>
             </w:r>
           </w:p>
         </w:tc>
@@ -13567,7 +14500,7 @@
               <w:cnfStyle w:val="000000000000" w:firstRow="0" w:lastRow="0" w:firstColumn="0" w:lastColumn="0" w:oddVBand="0" w:evenVBand="0" w:oddHBand="0" w:evenHBand="0" w:firstRowFirstColumn="0" w:firstRowLastColumn="0" w:lastRowFirstColumn="0" w:lastRowLastColumn="0"/>
             </w:pPr>
             <w:r>
-              <w:t>Pending</w:t>
+              <w:t>Complete</w:t>
             </w:r>
           </w:p>
         </w:tc>
@@ -13647,7 +14580,7 @@
               <w:cnfStyle w:val="000000100000" w:firstRow="0" w:lastRow="0" w:firstColumn="0" w:lastColumn="0" w:oddVBand="0" w:evenVBand="0" w:oddHBand="1" w:evenHBand="0" w:firstRowFirstColumn="0" w:firstRowLastColumn="0" w:lastRowFirstColumn="0" w:lastRowLastColumn="0"/>
             </w:pPr>
             <w:r>
-              <w:t>Pending</w:t>
+              <w:t>Complete</w:t>
             </w:r>
           </w:p>
         </w:tc>
@@ -13724,7 +14657,7 @@
               <w:cnfStyle w:val="000000000000" w:firstRow="0" w:lastRow="0" w:firstColumn="0" w:lastColumn="0" w:oddVBand="0" w:evenVBand="0" w:oddHBand="0" w:evenHBand="0" w:firstRowFirstColumn="0" w:firstRowLastColumn="0" w:lastRowFirstColumn="0" w:lastRowLastColumn="0"/>
             </w:pPr>
             <w:r>
-              <w:t>Pending</w:t>
+              <w:t>Complete</w:t>
             </w:r>
           </w:p>
         </w:tc>
@@ -13744,7 +14677,6 @@
               <w:spacing w:after="0"/>
             </w:pPr>
             <w:r>
-              <w:lastRenderedPageBreak/>
               <w:t>FR-GS-10</w:t>
             </w:r>
           </w:p>
@@ -13805,7 +14737,7 @@
               <w:cnfStyle w:val="000000100000" w:firstRow="0" w:lastRow="0" w:firstColumn="0" w:lastColumn="0" w:oddVBand="0" w:evenVBand="0" w:oddHBand="1" w:evenHBand="0" w:firstRowFirstColumn="0" w:firstRowLastColumn="0" w:lastRowFirstColumn="0" w:lastRowLastColumn="0"/>
             </w:pPr>
             <w:r>
-              <w:t>Pending</w:t>
+              <w:t>Complete</w:t>
             </w:r>
           </w:p>
         </w:tc>
@@ -13882,7 +14814,7 @@
               <w:cnfStyle w:val="000000000000" w:firstRow="0" w:lastRow="0" w:firstColumn="0" w:lastColumn="0" w:oddVBand="0" w:evenVBand="0" w:oddHBand="0" w:evenHBand="0" w:firstRowFirstColumn="0" w:firstRowLastColumn="0" w:lastRowFirstColumn="0" w:lastRowLastColumn="0"/>
             </w:pPr>
             <w:r>
-              <w:t>Pending</w:t>
+              <w:t>Complete</w:t>
             </w:r>
           </w:p>
         </w:tc>
@@ -13962,7 +14894,7 @@
               <w:cnfStyle w:val="000000100000" w:firstRow="0" w:lastRow="0" w:firstColumn="0" w:lastColumn="0" w:oddVBand="0" w:evenVBand="0" w:oddHBand="1" w:evenHBand="0" w:firstRowFirstColumn="0" w:firstRowLastColumn="0" w:lastRowFirstColumn="0" w:lastRowLastColumn="0"/>
             </w:pPr>
             <w:r>
-              <w:t>Pending</w:t>
+              <w:t>Complete</w:t>
             </w:r>
           </w:p>
         </w:tc>
@@ -14039,7 +14971,7 @@
               <w:cnfStyle w:val="000000000000" w:firstRow="0" w:lastRow="0" w:firstColumn="0" w:lastColumn="0" w:oddVBand="0" w:evenVBand="0" w:oddHBand="0" w:evenHBand="0" w:firstRowFirstColumn="0" w:firstRowLastColumn="0" w:lastRowFirstColumn="0" w:lastRowLastColumn="0"/>
             </w:pPr>
             <w:r>
-              <w:t>Pending</w:t>
+              <w:t>Complete</w:t>
             </w:r>
           </w:p>
         </w:tc>
@@ -14119,7 +15051,7 @@
               <w:cnfStyle w:val="000000100000" w:firstRow="0" w:lastRow="0" w:firstColumn="0" w:lastColumn="0" w:oddVBand="0" w:evenVBand="0" w:oddHBand="1" w:evenHBand="0" w:firstRowFirstColumn="0" w:firstRowLastColumn="0" w:lastRowFirstColumn="0" w:lastRowLastColumn="0"/>
             </w:pPr>
             <w:r>
-              <w:t>Pending</w:t>
+              <w:t>Complete</w:t>
             </w:r>
           </w:p>
         </w:tc>
@@ -14196,7 +15128,7 @@
               <w:cnfStyle w:val="000000000000" w:firstRow="0" w:lastRow="0" w:firstColumn="0" w:lastColumn="0" w:oddVBand="0" w:evenVBand="0" w:oddHBand="0" w:evenHBand="0" w:firstRowFirstColumn="0" w:firstRowLastColumn="0" w:lastRowFirstColumn="0" w:lastRowLastColumn="0"/>
             </w:pPr>
             <w:r>
-              <w:t>Pending</w:t>
+              <w:t>Complete</w:t>
             </w:r>
           </w:p>
         </w:tc>
@@ -14276,7 +15208,7 @@
               <w:cnfStyle w:val="000000100000" w:firstRow="0" w:lastRow="0" w:firstColumn="0" w:lastColumn="0" w:oddVBand="0" w:evenVBand="0" w:oddHBand="1" w:evenHBand="0" w:firstRowFirstColumn="0" w:firstRowLastColumn="0" w:lastRowFirstColumn="0" w:lastRowLastColumn="0"/>
             </w:pPr>
             <w:r>
-              <w:t>Pending</w:t>
+              <w:t>Complete</w:t>
             </w:r>
           </w:p>
         </w:tc>
@@ -14359,7 +15291,7 @@
               <w:cnfStyle w:val="000000000000" w:firstRow="0" w:lastRow="0" w:firstColumn="0" w:lastColumn="0" w:oddVBand="0" w:evenVBand="0" w:oddHBand="0" w:evenHBand="0" w:firstRowFirstColumn="0" w:firstRowLastColumn="0" w:lastRowFirstColumn="0" w:lastRowLastColumn="0"/>
             </w:pPr>
             <w:r>
-              <w:t>Pending</w:t>
+              <w:t>Complete</w:t>
             </w:r>
           </w:p>
         </w:tc>
@@ -14439,7 +15371,7 @@
               <w:cnfStyle w:val="000000100000" w:firstRow="0" w:lastRow="0" w:firstColumn="0" w:lastColumn="0" w:oddVBand="0" w:evenVBand="0" w:oddHBand="1" w:evenHBand="0" w:firstRowFirstColumn="0" w:firstRowLastColumn="0" w:lastRowFirstColumn="0" w:lastRowLastColumn="0"/>
             </w:pPr>
             <w:r>
-              <w:t>Pending</w:t>
+              <w:t>Complete</w:t>
             </w:r>
           </w:p>
         </w:tc>
@@ -14516,7 +15448,7 @@
               <w:cnfStyle w:val="000000000000" w:firstRow="0" w:lastRow="0" w:firstColumn="0" w:lastColumn="0" w:oddVBand="0" w:evenVBand="0" w:oddHBand="0" w:evenHBand="0" w:firstRowFirstColumn="0" w:firstRowLastColumn="0" w:lastRowFirstColumn="0" w:lastRowLastColumn="0"/>
             </w:pPr>
             <w:r>
-              <w:t>Pending</w:t>
+              <w:t>Complete</w:t>
             </w:r>
           </w:p>
         </w:tc>
@@ -14602,7 +15534,7 @@
               <w:cnfStyle w:val="000000100000" w:firstRow="0" w:lastRow="0" w:firstColumn="0" w:lastColumn="0" w:oddVBand="0" w:evenVBand="0" w:oddHBand="1" w:evenHBand="0" w:firstRowFirstColumn="0" w:firstRowLastColumn="0" w:lastRowFirstColumn="0" w:lastRowLastColumn="0"/>
             </w:pPr>
             <w:r>
-              <w:t>Pending</w:t>
+              <w:t>Complete</w:t>
             </w:r>
           </w:p>
         </w:tc>
@@ -14679,7 +15611,7 @@
               <w:cnfStyle w:val="000000000000" w:firstRow="0" w:lastRow="0" w:firstColumn="0" w:lastColumn="0" w:oddVBand="0" w:evenVBand="0" w:oddHBand="0" w:evenHBand="0" w:firstRowFirstColumn="0" w:firstRowLastColumn="0" w:lastRowFirstColumn="0" w:lastRowLastColumn="0"/>
             </w:pPr>
             <w:r>
-              <w:t>Pending</w:t>
+              <w:t>Complete</w:t>
             </w:r>
           </w:p>
         </w:tc>
@@ -14759,7 +15691,7 @@
               <w:cnfStyle w:val="000000100000" w:firstRow="0" w:lastRow="0" w:firstColumn="0" w:lastColumn="0" w:oddVBand="0" w:evenVBand="0" w:oddHBand="1" w:evenHBand="0" w:firstRowFirstColumn="0" w:firstRowLastColumn="0" w:lastRowFirstColumn="0" w:lastRowLastColumn="0"/>
             </w:pPr>
             <w:r>
-              <w:t>Pending</w:t>
+              <w:t>Complete</w:t>
             </w:r>
           </w:p>
         </w:tc>
@@ -14836,7 +15768,7 @@
               <w:cnfStyle w:val="000000000000" w:firstRow="0" w:lastRow="0" w:firstColumn="0" w:lastColumn="0" w:oddVBand="0" w:evenVBand="0" w:oddHBand="0" w:evenHBand="0" w:firstRowFirstColumn="0" w:firstRowLastColumn="0" w:lastRowFirstColumn="0" w:lastRowLastColumn="0"/>
             </w:pPr>
             <w:r>
-              <w:t>Pending</w:t>
+              <w:t>Complete</w:t>
             </w:r>
           </w:p>
         </w:tc>
@@ -14922,7 +15854,7 @@
               <w:cnfStyle w:val="000000100000" w:firstRow="0" w:lastRow="0" w:firstColumn="0" w:lastColumn="0" w:oddVBand="0" w:evenVBand="0" w:oddHBand="1" w:evenHBand="0" w:firstRowFirstColumn="0" w:firstRowLastColumn="0" w:lastRowFirstColumn="0" w:lastRowLastColumn="0"/>
             </w:pPr>
             <w:r>
-              <w:t>Pending</w:t>
+              <w:t>Complete</w:t>
             </w:r>
           </w:p>
         </w:tc>
@@ -14999,7 +15931,7 @@
               <w:cnfStyle w:val="000000000000" w:firstRow="0" w:lastRow="0" w:firstColumn="0" w:lastColumn="0" w:oddVBand="0" w:evenVBand="0" w:oddHBand="0" w:evenHBand="0" w:firstRowFirstColumn="0" w:firstRowLastColumn="0" w:lastRowFirstColumn="0" w:lastRowLastColumn="0"/>
             </w:pPr>
             <w:r>
-              <w:t>Pending</w:t>
+              <w:t>Complete</w:t>
             </w:r>
           </w:p>
         </w:tc>
@@ -15027,7 +15959,7 @@
       <w:pPr>
         <w:pStyle w:val="Heading1"/>
       </w:pPr>
-      <w:bookmarkStart w:id="49" w:name="_Toc229583562"/>
+      <w:bookmarkStart w:id="49" w:name="_Toc229731037"/>
       <w:r>
         <w:t>Approval and Sign-Off</w:t>
       </w:r>
@@ -15194,6 +16126,9 @@
             <w:pPr>
               <w:spacing w:after="0"/>
             </w:pPr>
+            <w:r>
+              <w:t>5/15/2026</w:t>
+            </w:r>
           </w:p>
         </w:tc>
       </w:tr>
@@ -15248,7 +16183,7 @@
       <w:pPr>
         <w:pStyle w:val="Heading1"/>
       </w:pPr>
-      <w:bookmarkStart w:id="50" w:name="_Toc229583563"/>
+      <w:bookmarkStart w:id="50" w:name="_Toc229731038"/>
       <w:r>
         <w:t>Revision History</w:t>
       </w:r>
@@ -15432,11 +16367,131 @@
           </w:p>
         </w:tc>
       </w:tr>
+      <w:tr>
+        <w:tc>
+          <w:tcPr>
+            <w:tcW w:w="1525" w:type="dxa"/>
+          </w:tcPr>
+          <w:p>
+            <w:pPr>
+              <w:spacing w:after="0"/>
+              <w:ind w:left="-137" w:right="-79"/>
+              <w:jc w:val="center"/>
+            </w:pPr>
+            <w:r>
+              <w:t>05/15/2026</w:t>
+            </w:r>
+          </w:p>
+        </w:tc>
+        <w:tc>
+          <w:tcPr>
+            <w:tcW w:w="1170" w:type="dxa"/>
+          </w:tcPr>
+          <w:p>
+            <w:pPr>
+              <w:spacing w:after="0"/>
+              <w:ind w:left="-137" w:right="-79"/>
+              <w:jc w:val="center"/>
+            </w:pPr>
+            <w:r>
+              <w:t>1.1</w:t>
+            </w:r>
+          </w:p>
+        </w:tc>
+        <w:tc>
+          <w:tcPr>
+            <w:tcW w:w="1620" w:type="dxa"/>
+          </w:tcPr>
+          <w:p>
+            <w:pPr>
+              <w:spacing w:after="0"/>
+              <w:ind w:left="-137" w:right="-79"/>
+            </w:pPr>
+            <w:r>
+              <w:t>Tom DiGuido</w:t>
+            </w:r>
+          </w:p>
+        </w:tc>
+        <w:tc>
+          <w:tcPr>
+            <w:tcW w:w="4680" w:type="dxa"/>
+          </w:tcPr>
+          <w:p>
+            <w:pPr>
+              <w:spacing w:after="0"/>
+              <w:ind w:left="-137" w:right="-79"/>
+            </w:pPr>
+            <w:r>
+              <w:t>Updated the status of each test case. All test cases were performed successfully.</w:t>
+            </w:r>
+          </w:p>
+        </w:tc>
+      </w:tr>
+      <w:tr>
+        <w:tc>
+          <w:tcPr>
+            <w:tcW w:w="1525" w:type="dxa"/>
+          </w:tcPr>
+          <w:p>
+            <w:pPr>
+              <w:spacing w:after="0"/>
+              <w:ind w:left="-137" w:right="-79"/>
+              <w:jc w:val="center"/>
+            </w:pPr>
+            <w:r>
+              <w:t>05/15/2026</w:t>
+            </w:r>
+          </w:p>
+        </w:tc>
+        <w:tc>
+          <w:tcPr>
+            <w:tcW w:w="1170" w:type="dxa"/>
+          </w:tcPr>
+          <w:p>
+            <w:pPr>
+              <w:spacing w:after="0"/>
+              <w:ind w:left="-137" w:right="-79"/>
+              <w:jc w:val="center"/>
+            </w:pPr>
+            <w:r>
+              <w:t>1.1</w:t>
+            </w:r>
+          </w:p>
+        </w:tc>
+        <w:tc>
+          <w:tcPr>
+            <w:tcW w:w="1620" w:type="dxa"/>
+          </w:tcPr>
+          <w:p>
+            <w:pPr>
+              <w:spacing w:after="0"/>
+              <w:ind w:left="-137" w:right="-79"/>
+            </w:pPr>
+            <w:r>
+              <w:t>Tom DiGuido</w:t>
+            </w:r>
+          </w:p>
+        </w:tc>
+        <w:tc>
+          <w:tcPr>
+            <w:tcW w:w="4680" w:type="dxa"/>
+          </w:tcPr>
+          <w:p>
+            <w:pPr>
+              <w:spacing w:after="0"/>
+              <w:ind w:left="-137" w:right="-79"/>
+            </w:pPr>
+            <w:r>
+              <w:t>Updated the status of each Functional Requirement to ‘Complete” in the Traceability Matrix. Each requirement was verified as part of the test plan and test cases.</w:t>
+            </w:r>
+          </w:p>
+        </w:tc>
+      </w:tr>
     </w:tbl>
     <w:p/>
     <w:sectPr>
-      <w:headerReference w:type="default" r:id="rId7"/>
-      <w:footerReference w:type="default" r:id="rId8"/>
+      <w:headerReference w:type="default" r:id="rId17"/>
+      <w:footerReference w:type="default" r:id="rId18"/>
       <w:pgSz w:w="11906" w:h="16838"/>
       <w:pgMar w:top="1134" w:right="1418" w:bottom="1134" w:left="1418" w:header="709" w:footer="709" w:gutter="0"/>
       <w:cols w:space="708"/>
@@ -15517,24 +16572,14 @@
           <w:r>
             <w:t xml:space="preserve"> of </w:t>
           </w:r>
-          <w:r>
-            <w:fldChar w:fldCharType="begin"/>
-          </w:r>
-          <w:r>
-            <w:instrText xml:space="preserve"> NUMPAGES </w:instrText>
-          </w:r>
-          <w:r>
-            <w:fldChar w:fldCharType="separate"/>
-          </w:r>
-          <w:r>
-            <w:rPr>
-              <w:noProof/>
-            </w:rPr>
-            <w:t>7</w:t>
-          </w:r>
-          <w:r>
-            <w:fldChar w:fldCharType="end"/>
-          </w:r>
+          <w:fldSimple w:instr=" NUMPAGES ">
+            <w:r>
+              <w:rPr>
+                <w:noProof/>
+              </w:rPr>
+              <w:t>7</w:t>
+            </w:r>
+          </w:fldSimple>
         </w:p>
       </w:tc>
     </w:tr>
@@ -15610,7 +16655,7 @@
             <w:t>1.</w:t>
           </w:r>
           <w:r>
-            <w:t>0</w:t>
+            <w:t>1</w:t>
           </w:r>
         </w:p>
       </w:tc>
@@ -16500,6 +17545,7 @@
   <w:style w:type="character" w:default="1" w:styleId="DefaultParagraphFont">
     <w:name w:val="Default Paragraph Font"/>
     <w:uiPriority w:val="1"/>
+    <w:semiHidden/>
     <w:unhideWhenUsed/>
   </w:style>
   <w:style w:type="table" w:default="1" w:styleId="TableNormal">

</xml_diff>

<commit_message>
Updated Test Plan and Traceability document
</commit_message>
<xml_diff>
--- a/Insomniac_Test_Plan_and_Traceability_Matrix.docx
+++ b/Insomniac_Test_Plan_and_Traceability_Matrix.docx
@@ -7066,6 +7066,9 @@
               <w:cnfStyle w:val="000000100000" w:firstRow="0" w:lastRow="0" w:firstColumn="0" w:lastColumn="0" w:oddVBand="0" w:evenVBand="0" w:oddHBand="1" w:evenHBand="0" w:firstRowFirstColumn="0" w:firstRowLastColumn="0" w:lastRowFirstColumn="0" w:lastRowLastColumn="0"/>
             </w:pPr>
             <w:r>
+              <w:rPr>
+                <w:noProof/>
+              </w:rPr>
               <w:drawing>
                 <wp:inline distT="0" distB="0" distL="0" distR="0" wp14:anchorId="3D1BBEB7" wp14:editId="27F3BC94">
                   <wp:extent cx="786384" cy="685800"/>
@@ -7469,6 +7472,9 @@
               <w:cnfStyle w:val="000000100000" w:firstRow="0" w:lastRow="0" w:firstColumn="0" w:lastColumn="0" w:oddVBand="0" w:evenVBand="0" w:oddHBand="1" w:evenHBand="0" w:firstRowFirstColumn="0" w:firstRowLastColumn="0" w:lastRowFirstColumn="0" w:lastRowLastColumn="0"/>
             </w:pPr>
             <w:r>
+              <w:rPr>
+                <w:noProof/>
+              </w:rPr>
               <w:drawing>
                 <wp:inline distT="0" distB="0" distL="0" distR="0" wp14:anchorId="697318CC" wp14:editId="1D61143B">
                   <wp:extent cx="786384" cy="685800"/>
@@ -8696,6 +8702,9 @@
               <w:cnfStyle w:val="000000100000" w:firstRow="0" w:lastRow="0" w:firstColumn="0" w:lastColumn="0" w:oddVBand="0" w:evenVBand="0" w:oddHBand="1" w:evenHBand="0" w:firstRowFirstColumn="0" w:firstRowLastColumn="0" w:lastRowFirstColumn="0" w:lastRowLastColumn="0"/>
             </w:pPr>
             <w:r>
+              <w:rPr>
+                <w:noProof/>
+              </w:rPr>
               <w:drawing>
                 <wp:inline distT="0" distB="0" distL="0" distR="0" wp14:anchorId="359FAC41" wp14:editId="0F33E905">
                   <wp:extent cx="786384" cy="685800"/>
@@ -9524,6 +9533,9 @@
               <w:cnfStyle w:val="000000100000" w:firstRow="0" w:lastRow="0" w:firstColumn="0" w:lastColumn="0" w:oddVBand="0" w:evenVBand="0" w:oddHBand="1" w:evenHBand="0" w:firstRowFirstColumn="0" w:firstRowLastColumn="0" w:lastRowFirstColumn="0" w:lastRowLastColumn="0"/>
             </w:pPr>
             <w:r>
+              <w:rPr>
+                <w:noProof/>
+              </w:rPr>
               <w:drawing>
                 <wp:inline distT="0" distB="0" distL="0" distR="0" wp14:anchorId="12E6E167" wp14:editId="57791B7F">
                   <wp:extent cx="786384" cy="685800"/>
@@ -10328,6 +10340,9 @@
               <w:cnfStyle w:val="000000100000" w:firstRow="0" w:lastRow="0" w:firstColumn="0" w:lastColumn="0" w:oddVBand="0" w:evenVBand="0" w:oddHBand="1" w:evenHBand="0" w:firstRowFirstColumn="0" w:firstRowLastColumn="0" w:lastRowFirstColumn="0" w:lastRowLastColumn="0"/>
             </w:pPr>
             <w:r>
+              <w:rPr>
+                <w:noProof/>
+              </w:rPr>
               <w:drawing>
                 <wp:inline distT="0" distB="0" distL="0" distR="0" wp14:anchorId="00716D69" wp14:editId="5C20C9A0">
                   <wp:extent cx="786384" cy="685800"/>
@@ -10720,6 +10735,9 @@
               <w:cnfStyle w:val="000000100000" w:firstRow="0" w:lastRow="0" w:firstColumn="0" w:lastColumn="0" w:oddVBand="0" w:evenVBand="0" w:oddHBand="1" w:evenHBand="0" w:firstRowFirstColumn="0" w:firstRowLastColumn="0" w:lastRowFirstColumn="0" w:lastRowLastColumn="0"/>
             </w:pPr>
             <w:r>
+              <w:rPr>
+                <w:noProof/>
+              </w:rPr>
               <w:drawing>
                 <wp:inline distT="0" distB="0" distL="0" distR="0" wp14:anchorId="06B7BB18" wp14:editId="732C2930">
                   <wp:extent cx="786384" cy="685800"/>
@@ -11113,6 +11131,9 @@
               <w:cnfStyle w:val="000000100000" w:firstRow="0" w:lastRow="0" w:firstColumn="0" w:lastColumn="0" w:oddVBand="0" w:evenVBand="0" w:oddHBand="1" w:evenHBand="0" w:firstRowFirstColumn="0" w:firstRowLastColumn="0" w:lastRowFirstColumn="0" w:lastRowLastColumn="0"/>
             </w:pPr>
             <w:r>
+              <w:rPr>
+                <w:noProof/>
+              </w:rPr>
               <w:drawing>
                 <wp:inline distT="0" distB="0" distL="0" distR="0" wp14:anchorId="2674DCD2" wp14:editId="00351359">
                   <wp:extent cx="786384" cy="685800"/>
@@ -16085,6 +16106,9 @@
             <w:pPr>
               <w:spacing w:after="0"/>
             </w:pPr>
+            <w:r>
+              <w:t>5/16/2026</w:t>
+            </w:r>
           </w:p>
         </w:tc>
       </w:tr>
@@ -16170,6 +16194,9 @@
             <w:pPr>
               <w:spacing w:after="0"/>
             </w:pPr>
+            <w:r>
+              <w:t>5/16/2026</w:t>
+            </w:r>
           </w:p>
         </w:tc>
       </w:tr>

</xml_diff>